<commit_message>
run model with new data (smaller park buffers)
</commit_message>
<xml_diff>
--- a/data/metadata.docx
+++ b/data/metadata.docx
@@ -54,22 +54,189 @@
           <w:bCs/>
           <w:lang w:val="en-CA"/>
         </w:rPr>
-        <w:t>lepidoptera_trait_data/SpeciesListForTraits.csv</w:t>
-      </w:r>
-    </w:p>
-    <w:p>
-      <w:pPr>
-        <w:rPr>
-          <w:lang w:val="en-CA"/>
-        </w:rPr>
-      </w:pPr>
-      <w:r>
-        <w:rPr>
-          <w:lang w:val="en-CA"/>
-        </w:rPr>
-        <w:t xml:space="preserve">These are the trait data for all lepidoptera species included in the study. Lepidoptera trait data initially originated from: </w:t>
+        <w:t>lepidoptera_trait_data/SpeciesListForTraits</w:t>
+      </w:r>
+      <w:r>
+        <w:rPr>
+          <w:b/>
+          <w:bCs/>
+          <w:lang w:val="en-CA"/>
+        </w:rPr>
+        <w:t>_original</w:t>
+      </w:r>
+      <w:r>
+        <w:rPr>
+          <w:b/>
+          <w:bCs/>
+          <w:lang w:val="en-CA"/>
+        </w:rPr>
+        <w:t>.csv</w:t>
+      </w:r>
+    </w:p>
+    <w:p>
+      <w:pPr>
+        <w:rPr>
+          <w:b/>
+          <w:bCs/>
+          <w:lang w:val="en-CA"/>
+        </w:rPr>
+      </w:pPr>
+      <w:r>
+        <w:rPr>
+          <w:lang w:val="en-CA"/>
+        </w:rPr>
+        <w:t xml:space="preserve">For our analysis I used a different file </w:t>
+      </w:r>
+      <w:r>
+        <w:rPr>
+          <w:b/>
+          <w:bCs/>
+          <w:lang w:val="en-CA"/>
+        </w:rPr>
+        <w:t>./data/lepidoptera_trait_data/lepidoptera_trait_data/SpeciesListForTraits.csv</w:t>
+      </w:r>
+    </w:p>
+    <w:p>
+      <w:pPr>
+        <w:rPr>
+          <w:lang w:val="en-CA"/>
+        </w:rPr>
+      </w:pPr>
+      <w:r>
+        <w:rPr>
+          <w:lang w:val="en-CA"/>
+        </w:rPr>
+        <w:t xml:space="preserve">The new file (not the original one) I added in all species that were not previously included in the original dataset. In </w:t>
+      </w:r>
+      <w:proofErr w:type="gramStart"/>
+      <w:r>
+        <w:rPr>
+          <w:lang w:val="en-CA"/>
+        </w:rPr>
+        <w:t>this .</w:t>
+      </w:r>
+      <w:proofErr w:type="spellStart"/>
+      <w:r>
+        <w:rPr>
+          <w:lang w:val="en-CA"/>
+        </w:rPr>
+        <w:t>xslx</w:t>
+      </w:r>
+      <w:proofErr w:type="spellEnd"/>
+      <w:proofErr w:type="gramEnd"/>
+      <w:r>
+        <w:rPr>
+          <w:lang w:val="en-CA"/>
+        </w:rPr>
+        <w:t xml:space="preserve"> </w:t>
+      </w:r>
+      <w:proofErr w:type="spellStart"/>
+      <w:r>
+        <w:rPr>
+          <w:lang w:val="en-CA"/>
+        </w:rPr>
+        <w:t>spreadheet</w:t>
+      </w:r>
+      <w:proofErr w:type="spellEnd"/>
+      <w:r>
+        <w:rPr>
+          <w:lang w:val="en-CA"/>
+        </w:rPr>
+        <w:t xml:space="preserve"> all species highlight in red were added newly by me (J. Ulrich) beginning in May 2025.</w:t>
+      </w:r>
+      <w:r>
+        <w:rPr>
+          <w:lang w:val="en-CA"/>
+        </w:rPr>
+        <w:t xml:space="preserve"> I added data on wingspan from </w:t>
+      </w:r>
+      <w:proofErr w:type="spellStart"/>
+      <w:r>
+        <w:rPr>
+          <w:lang w:val="en-CA"/>
+        </w:rPr>
+        <w:t>LepTraits</w:t>
+      </w:r>
+      <w:proofErr w:type="spellEnd"/>
+      <w:r>
+        <w:rPr>
+          <w:lang w:val="en-CA"/>
+        </w:rPr>
+        <w:t xml:space="preserve"> v1.0 and on feature diversity </w:t>
+      </w:r>
+      <w:r>
+        <w:rPr>
+          <w:lang w:val="en-CA"/>
+        </w:rPr>
+        <w:t>by parsing the descriptions of each species from the Butterflies and Moths of North America (BAMONA) website (</w:t>
       </w:r>
       <w:hyperlink r:id="rId4" w:history="1">
+        <w:r>
+          <w:rPr>
+            <w:rStyle w:val="Hyperlink"/>
+            <w:lang w:val="en-CA"/>
+          </w:rPr>
+          <w:t>www.butterfliesandmoths.org</w:t>
+        </w:r>
+      </w:hyperlink>
+      <w:r>
+        <w:rPr>
+          <w:lang w:val="en-CA"/>
+        </w:rPr>
+        <w:t>)</w:t>
+      </w:r>
+      <w:r>
+        <w:rPr>
+          <w:lang w:val="en-CA"/>
+        </w:rPr>
+        <w:t xml:space="preserve">, following their methods: </w:t>
+      </w:r>
+      <w:r>
+        <w:rPr>
+          <w:lang w:val="en-CA"/>
+        </w:rPr>
+        <w:t>features (</w:t>
+      </w:r>
+      <w:proofErr w:type="spellStart"/>
+      <w:r>
+        <w:rPr>
+          <w:lang w:val="en-CA"/>
+        </w:rPr>
+        <w:t>eg</w:t>
+      </w:r>
+      <w:proofErr w:type="spellEnd"/>
+      <w:r>
+        <w:rPr>
+          <w:lang w:val="en-CA"/>
+        </w:rPr>
+        <w:t xml:space="preserve"> “tail”, “spot”, “stripe”) from the identification field, then manually checked and corrected extracted values. Using these raw color and wing feature data, we calculated two derived trait metrics: color diversity (the number of colors present on the butterfly) and feature diversity (the number of features present on the butterfly) to capture potential associations between butterfly appearance and preference bias.</w:t>
+      </w:r>
+    </w:p>
+    <w:p>
+      <w:pPr>
+        <w:rPr>
+          <w:lang w:val="en-CA"/>
+        </w:rPr>
+      </w:pPr>
+      <w:r>
+        <w:rPr>
+          <w:lang w:val="en-CA"/>
+        </w:rPr>
+        <w:t>These are the trait data for all lepidoptera species included in the study</w:t>
+      </w:r>
+      <w:r>
+        <w:rPr>
+          <w:lang w:val="en-CA"/>
+        </w:rPr>
+        <w:t xml:space="preserve"> as directly obtained </w:t>
+      </w:r>
+      <w:r>
+        <w:rPr>
+          <w:lang w:val="en-CA"/>
+        </w:rPr>
+        <w:t xml:space="preserve">from: </w:t>
+      </w:r>
+      <w:hyperlink r:id="rId5" w:history="1">
         <w:r>
           <w:rPr>
             <w:rStyle w:val="Hyperlink"/>
@@ -108,7 +275,7 @@
         </w:rPr>
         <w:t xml:space="preserve">” </w:t>
       </w:r>
-      <w:hyperlink r:id="rId5" w:history="1">
+      <w:hyperlink r:id="rId6" w:history="1">
         <w:r>
           <w:rPr>
             <w:rStyle w:val="Hyperlink"/>
@@ -230,7 +397,21 @@
         <w:rPr>
           <w:lang w:val="en-CA"/>
         </w:rPr>
-        <w:t xml:space="preserve"> We resaved the file as a .csv version for processing in R. The .csv version contains all of the same identical data.</w:t>
+        <w:t xml:space="preserve"> We resaved the file as a .csv version for processing in R. The .csv version contains </w:t>
+      </w:r>
+      <w:proofErr w:type="gramStart"/>
+      <w:r>
+        <w:rPr>
+          <w:lang w:val="en-CA"/>
+        </w:rPr>
+        <w:t>all of</w:t>
+      </w:r>
+      <w:proofErr w:type="gramEnd"/>
+      <w:r>
+        <w:rPr>
+          <w:lang w:val="en-CA"/>
+        </w:rPr>
+        <w:t xml:space="preserve"> the same identical data.</w:t>
       </w:r>
       <w:r>
         <w:rPr>
@@ -312,8 +493,16 @@
         <w:rPr>
           <w:lang w:val="en-CA"/>
         </w:rPr>
-        <w:t>/GBIF, if those species appear in the "species" field</w:t>
-      </w:r>
+        <w:t xml:space="preserve">/GBIF, if those species appear in the "species" </w:t>
+      </w:r>
+      <w:proofErr w:type="gramStart"/>
+      <w:r>
+        <w:rPr>
+          <w:lang w:val="en-CA"/>
+        </w:rPr>
+        <w:t>field</w:t>
+      </w:r>
+      <w:proofErr w:type="gramEnd"/>
     </w:p>
     <w:p>
       <w:pPr>
@@ -361,8 +550,16 @@
         <w:rPr>
           <w:lang w:val="en-CA"/>
         </w:rPr>
-        <w:t>" field of GBIF data</w:t>
-      </w:r>
+        <w:t xml:space="preserve">" field of GBIF </w:t>
+      </w:r>
+      <w:proofErr w:type="gramStart"/>
+      <w:r>
+        <w:rPr>
+          <w:lang w:val="en-CA"/>
+        </w:rPr>
+        <w:t>data</w:t>
+      </w:r>
+      <w:proofErr w:type="gramEnd"/>
     </w:p>
     <w:p>
       <w:pPr>
@@ -446,32 +643,41 @@
           <w:iCs/>
           <w:lang w:val="en-CA"/>
         </w:rPr>
-        <w:t xml:space="preserve"> [note from Jens U. (5.8.2025): it appears that Goldstein et al. 2024 calculated this value by average the values of “WS_L” (lower wingspan) and “WS_U” (upper wingspan) as listed in </w:t>
-      </w:r>
-      <w:proofErr w:type="spellStart"/>
+        <w:t xml:space="preserve"> [note from Jens U. (5.8.2025): it appears that Goldstein et al. 2024 calculated this value by average the values of “WS_L” (lower </w:t>
+      </w:r>
       <w:r>
         <w:rPr>
           <w:i/>
           <w:iCs/>
           <w:lang w:val="en-CA"/>
         </w:rPr>
-        <w:t>LepTraits</w:t>
-      </w:r>
-      <w:proofErr w:type="spellEnd"/>
+        <w:lastRenderedPageBreak/>
+        <w:t xml:space="preserve">wingspan) and “WS_U” (upper wingspan) as listed in </w:t>
+      </w:r>
+      <w:proofErr w:type="spellStart"/>
       <w:r>
         <w:rPr>
           <w:i/>
           <w:iCs/>
           <w:lang w:val="en-CA"/>
         </w:rPr>
-        <w:t>. I performed the same calculation for any new species added to the dataset.</w:t>
-      </w:r>
+        <w:t>LepTraits</w:t>
+      </w:r>
+      <w:proofErr w:type="spellEnd"/>
       <w:r>
         <w:rPr>
           <w:i/>
           <w:iCs/>
           <w:lang w:val="en-CA"/>
         </w:rPr>
+        <w:t>. I performed the same calculation for any new species added to the dataset.</w:t>
+      </w:r>
+      <w:r>
+        <w:rPr>
+          <w:i/>
+          <w:iCs/>
+          <w:lang w:val="en-CA"/>
+        </w:rPr>
         <w:t>]</w:t>
       </w:r>
     </w:p>
@@ -485,217 +691,352 @@
         <w:rPr>
           <w:lang w:val="en-CA"/>
         </w:rPr>
-        <w:t>black - whether or not the species has black on its wing</w:t>
-      </w:r>
-    </w:p>
-    <w:p>
-      <w:pPr>
-        <w:rPr>
-          <w:lang w:val="en-CA"/>
-        </w:rPr>
-      </w:pPr>
-      <w:r>
-        <w:rPr>
-          <w:lang w:val="en-CA"/>
-        </w:rPr>
-        <w:t>gray - whether or not the species has gray on its wing</w:t>
-      </w:r>
-    </w:p>
-    <w:p>
-      <w:pPr>
-        <w:rPr>
-          <w:lang w:val="en-CA"/>
-        </w:rPr>
-      </w:pPr>
-      <w:r>
-        <w:rPr>
-          <w:lang w:val="en-CA"/>
-        </w:rPr>
-        <w:t>white - whether or not the species has white on its wing</w:t>
-      </w:r>
-    </w:p>
-    <w:p>
-      <w:pPr>
-        <w:rPr>
-          <w:lang w:val="en-CA"/>
-        </w:rPr>
-      </w:pPr>
-      <w:r>
-        <w:rPr>
-          <w:lang w:val="en-CA"/>
-        </w:rPr>
-        <w:t>brown - whether or not the species has brown on its wing</w:t>
-      </w:r>
-    </w:p>
-    <w:p>
-      <w:pPr>
-        <w:rPr>
-          <w:lang w:val="en-CA"/>
-        </w:rPr>
-      </w:pPr>
-      <w:r>
-        <w:rPr>
-          <w:lang w:val="en-CA"/>
-        </w:rPr>
-        <w:t>red - whether or not the species has red on its wing</w:t>
-      </w:r>
-    </w:p>
-    <w:p>
-      <w:pPr>
-        <w:rPr>
-          <w:lang w:val="en-CA"/>
-        </w:rPr>
-      </w:pPr>
-      <w:r>
-        <w:rPr>
-          <w:lang w:val="en-CA"/>
-        </w:rPr>
-        <w:t>orange - whether or not the species has orange on its wing</w:t>
-      </w:r>
-    </w:p>
-    <w:p>
-      <w:pPr>
-        <w:rPr>
-          <w:lang w:val="en-CA"/>
-        </w:rPr>
-      </w:pPr>
-      <w:r>
-        <w:rPr>
-          <w:lang w:val="en-CA"/>
-        </w:rPr>
-        <w:lastRenderedPageBreak/>
-        <w:t>yellow - whether or not the species has yellow on its wing</w:t>
-      </w:r>
-    </w:p>
-    <w:p>
-      <w:pPr>
-        <w:rPr>
-          <w:lang w:val="en-CA"/>
-        </w:rPr>
-      </w:pPr>
-      <w:r>
-        <w:rPr>
-          <w:lang w:val="en-CA"/>
-        </w:rPr>
-        <w:t>green - whether or not the species has green on its wing</w:t>
-      </w:r>
-    </w:p>
-    <w:p>
-      <w:pPr>
-        <w:rPr>
-          <w:lang w:val="en-CA"/>
-        </w:rPr>
-      </w:pPr>
-      <w:r>
-        <w:rPr>
-          <w:lang w:val="en-CA"/>
-        </w:rPr>
-        <w:t>blue - whether or not the species has blue on its wing</w:t>
-      </w:r>
-    </w:p>
-    <w:p>
-      <w:pPr>
-        <w:rPr>
-          <w:lang w:val="en-CA"/>
-        </w:rPr>
-      </w:pPr>
-      <w:r>
-        <w:rPr>
-          <w:lang w:val="en-CA"/>
-        </w:rPr>
-        <w:t>pink - whether or not the species has pink on its wing</w:t>
-      </w:r>
-    </w:p>
-    <w:p>
-      <w:pPr>
-        <w:rPr>
-          <w:lang w:val="en-CA"/>
-        </w:rPr>
-      </w:pPr>
-      <w:r>
-        <w:rPr>
-          <w:lang w:val="en-CA"/>
-        </w:rPr>
-        <w:t>purple - whether or not the species has purple on its wing</w:t>
-      </w:r>
-    </w:p>
-    <w:p>
-      <w:pPr>
-        <w:rPr>
-          <w:lang w:val="en-CA"/>
-        </w:rPr>
-      </w:pPr>
-      <w:r>
-        <w:rPr>
-          <w:lang w:val="en-CA"/>
-        </w:rPr>
-        <w:t>eyespot - whether or not the species has an eyespot feature on its wing</w:t>
-      </w:r>
-    </w:p>
-    <w:p>
-      <w:pPr>
-        <w:rPr>
-          <w:lang w:val="en-CA"/>
-        </w:rPr>
-      </w:pPr>
-      <w:r>
-        <w:rPr>
-          <w:lang w:val="en-CA"/>
-        </w:rPr>
-        <w:t>stripe - whether or not the species has a stripe feature on its wing</w:t>
-      </w:r>
-    </w:p>
-    <w:p>
-      <w:pPr>
-        <w:rPr>
-          <w:lang w:val="en-CA"/>
-        </w:rPr>
-      </w:pPr>
-      <w:r>
-        <w:rPr>
-          <w:lang w:val="en-CA"/>
-        </w:rPr>
-        <w:t>checker - whether or not the species has a checker feature on its wing</w:t>
-      </w:r>
-    </w:p>
-    <w:p>
-      <w:pPr>
-        <w:rPr>
-          <w:lang w:val="en-CA"/>
-        </w:rPr>
-      </w:pPr>
-      <w:r>
-        <w:rPr>
-          <w:lang w:val="en-CA"/>
-        </w:rPr>
-        <w:t>tail - whether or not the species has a wing tail</w:t>
-      </w:r>
-    </w:p>
-    <w:p>
-      <w:pPr>
-        <w:rPr>
-          <w:lang w:val="en-CA"/>
-        </w:rPr>
-      </w:pPr>
-      <w:r>
-        <w:rPr>
-          <w:lang w:val="en-CA"/>
-        </w:rPr>
-        <w:t>band - whether or not the species has a banding feature on its wing</w:t>
-      </w:r>
-    </w:p>
-    <w:p>
-      <w:pPr>
-        <w:rPr>
-          <w:lang w:val="en-CA"/>
-        </w:rPr>
-      </w:pPr>
-      <w:r>
-        <w:rPr>
-          <w:lang w:val="en-CA"/>
-        </w:rPr>
-        <w:t>spot - whether or not the species has a spot feature on its wing</w:t>
-      </w:r>
+        <w:t xml:space="preserve">black - whether or not the species has black on its </w:t>
+      </w:r>
+      <w:proofErr w:type="gramStart"/>
+      <w:r>
+        <w:rPr>
+          <w:lang w:val="en-CA"/>
+        </w:rPr>
+        <w:t>wing</w:t>
+      </w:r>
+      <w:proofErr w:type="gramEnd"/>
+    </w:p>
+    <w:p>
+      <w:pPr>
+        <w:rPr>
+          <w:lang w:val="en-CA"/>
+        </w:rPr>
+      </w:pPr>
+      <w:r>
+        <w:rPr>
+          <w:lang w:val="en-CA"/>
+        </w:rPr>
+        <w:t xml:space="preserve">gray - whether or not the species has gray on its </w:t>
+      </w:r>
+      <w:proofErr w:type="gramStart"/>
+      <w:r>
+        <w:rPr>
+          <w:lang w:val="en-CA"/>
+        </w:rPr>
+        <w:t>wing</w:t>
+      </w:r>
+      <w:proofErr w:type="gramEnd"/>
+    </w:p>
+    <w:p>
+      <w:pPr>
+        <w:rPr>
+          <w:lang w:val="en-CA"/>
+        </w:rPr>
+      </w:pPr>
+      <w:r>
+        <w:rPr>
+          <w:lang w:val="en-CA"/>
+        </w:rPr>
+        <w:t xml:space="preserve">white - whether or not the species has white on its </w:t>
+      </w:r>
+      <w:proofErr w:type="gramStart"/>
+      <w:r>
+        <w:rPr>
+          <w:lang w:val="en-CA"/>
+        </w:rPr>
+        <w:t>wing</w:t>
+      </w:r>
+      <w:proofErr w:type="gramEnd"/>
+    </w:p>
+    <w:p>
+      <w:pPr>
+        <w:rPr>
+          <w:lang w:val="en-CA"/>
+        </w:rPr>
+      </w:pPr>
+      <w:r>
+        <w:rPr>
+          <w:lang w:val="en-CA"/>
+        </w:rPr>
+        <w:t xml:space="preserve">brown - whether or not the species has brown on its </w:t>
+      </w:r>
+      <w:proofErr w:type="gramStart"/>
+      <w:r>
+        <w:rPr>
+          <w:lang w:val="en-CA"/>
+        </w:rPr>
+        <w:t>wing</w:t>
+      </w:r>
+      <w:proofErr w:type="gramEnd"/>
+    </w:p>
+    <w:p>
+      <w:pPr>
+        <w:rPr>
+          <w:lang w:val="en-CA"/>
+        </w:rPr>
+      </w:pPr>
+      <w:r>
+        <w:rPr>
+          <w:lang w:val="en-CA"/>
+        </w:rPr>
+        <w:t xml:space="preserve">red - whether or not the species has red on its </w:t>
+      </w:r>
+      <w:proofErr w:type="gramStart"/>
+      <w:r>
+        <w:rPr>
+          <w:lang w:val="en-CA"/>
+        </w:rPr>
+        <w:t>wing</w:t>
+      </w:r>
+      <w:proofErr w:type="gramEnd"/>
+    </w:p>
+    <w:p>
+      <w:pPr>
+        <w:rPr>
+          <w:lang w:val="en-CA"/>
+        </w:rPr>
+      </w:pPr>
+      <w:r>
+        <w:rPr>
+          <w:lang w:val="en-CA"/>
+        </w:rPr>
+        <w:t xml:space="preserve">orange - whether or not the species has orange on its </w:t>
+      </w:r>
+      <w:proofErr w:type="gramStart"/>
+      <w:r>
+        <w:rPr>
+          <w:lang w:val="en-CA"/>
+        </w:rPr>
+        <w:t>wing</w:t>
+      </w:r>
+      <w:proofErr w:type="gramEnd"/>
+    </w:p>
+    <w:p>
+      <w:pPr>
+        <w:rPr>
+          <w:lang w:val="en-CA"/>
+        </w:rPr>
+      </w:pPr>
+      <w:r>
+        <w:rPr>
+          <w:lang w:val="en-CA"/>
+        </w:rPr>
+        <w:t xml:space="preserve">yellow - whether or not the species has yellow on its </w:t>
+      </w:r>
+      <w:proofErr w:type="gramStart"/>
+      <w:r>
+        <w:rPr>
+          <w:lang w:val="en-CA"/>
+        </w:rPr>
+        <w:t>wing</w:t>
+      </w:r>
+      <w:proofErr w:type="gramEnd"/>
+    </w:p>
+    <w:p>
+      <w:pPr>
+        <w:rPr>
+          <w:lang w:val="en-CA"/>
+        </w:rPr>
+      </w:pPr>
+      <w:r>
+        <w:rPr>
+          <w:lang w:val="en-CA"/>
+        </w:rPr>
+        <w:t xml:space="preserve">green - whether or not the species has green on its </w:t>
+      </w:r>
+      <w:proofErr w:type="gramStart"/>
+      <w:r>
+        <w:rPr>
+          <w:lang w:val="en-CA"/>
+        </w:rPr>
+        <w:t>wing</w:t>
+      </w:r>
+      <w:proofErr w:type="gramEnd"/>
+    </w:p>
+    <w:p>
+      <w:pPr>
+        <w:rPr>
+          <w:lang w:val="en-CA"/>
+        </w:rPr>
+      </w:pPr>
+      <w:r>
+        <w:rPr>
+          <w:lang w:val="en-CA"/>
+        </w:rPr>
+        <w:t xml:space="preserve">blue - whether or not the species has blue on its </w:t>
+      </w:r>
+      <w:proofErr w:type="gramStart"/>
+      <w:r>
+        <w:rPr>
+          <w:lang w:val="en-CA"/>
+        </w:rPr>
+        <w:t>wing</w:t>
+      </w:r>
+      <w:proofErr w:type="gramEnd"/>
+    </w:p>
+    <w:p>
+      <w:pPr>
+        <w:rPr>
+          <w:lang w:val="en-CA"/>
+        </w:rPr>
+      </w:pPr>
+      <w:r>
+        <w:rPr>
+          <w:lang w:val="en-CA"/>
+        </w:rPr>
+        <w:t xml:space="preserve">pink - whether or not the species has pink on its </w:t>
+      </w:r>
+      <w:proofErr w:type="gramStart"/>
+      <w:r>
+        <w:rPr>
+          <w:lang w:val="en-CA"/>
+        </w:rPr>
+        <w:t>wing</w:t>
+      </w:r>
+      <w:proofErr w:type="gramEnd"/>
+    </w:p>
+    <w:p>
+      <w:pPr>
+        <w:rPr>
+          <w:lang w:val="en-CA"/>
+        </w:rPr>
+      </w:pPr>
+      <w:r>
+        <w:rPr>
+          <w:lang w:val="en-CA"/>
+        </w:rPr>
+        <w:t xml:space="preserve">purple - whether or not the species has purple on its </w:t>
+      </w:r>
+      <w:proofErr w:type="gramStart"/>
+      <w:r>
+        <w:rPr>
+          <w:lang w:val="en-CA"/>
+        </w:rPr>
+        <w:t>wing</w:t>
+      </w:r>
+      <w:proofErr w:type="gramEnd"/>
+    </w:p>
+    <w:p>
+      <w:pPr>
+        <w:rPr>
+          <w:lang w:val="en-CA"/>
+        </w:rPr>
+      </w:pPr>
+      <w:r>
+        <w:rPr>
+          <w:lang w:val="en-CA"/>
+        </w:rPr>
+        <w:t xml:space="preserve">eyespot - whether or not the species has an eyespot feature on its </w:t>
+      </w:r>
+      <w:proofErr w:type="gramStart"/>
+      <w:r>
+        <w:rPr>
+          <w:lang w:val="en-CA"/>
+        </w:rPr>
+        <w:t>wing</w:t>
+      </w:r>
+      <w:proofErr w:type="gramEnd"/>
+    </w:p>
+    <w:p>
+      <w:pPr>
+        <w:rPr>
+          <w:lang w:val="en-CA"/>
+        </w:rPr>
+      </w:pPr>
+      <w:r>
+        <w:rPr>
+          <w:lang w:val="en-CA"/>
+        </w:rPr>
+        <w:t xml:space="preserve">stripe - whether or not the species has a stripe feature on its </w:t>
+      </w:r>
+      <w:proofErr w:type="gramStart"/>
+      <w:r>
+        <w:rPr>
+          <w:lang w:val="en-CA"/>
+        </w:rPr>
+        <w:t>wing</w:t>
+      </w:r>
+      <w:proofErr w:type="gramEnd"/>
+    </w:p>
+    <w:p>
+      <w:pPr>
+        <w:rPr>
+          <w:lang w:val="en-CA"/>
+        </w:rPr>
+      </w:pPr>
+      <w:r>
+        <w:rPr>
+          <w:lang w:val="en-CA"/>
+        </w:rPr>
+        <w:t xml:space="preserve">checker - whether or not the species has a checker feature on its </w:t>
+      </w:r>
+      <w:proofErr w:type="gramStart"/>
+      <w:r>
+        <w:rPr>
+          <w:lang w:val="en-CA"/>
+        </w:rPr>
+        <w:t>wing</w:t>
+      </w:r>
+      <w:proofErr w:type="gramEnd"/>
+    </w:p>
+    <w:p>
+      <w:pPr>
+        <w:rPr>
+          <w:lang w:val="en-CA"/>
+        </w:rPr>
+      </w:pPr>
+      <w:r>
+        <w:rPr>
+          <w:lang w:val="en-CA"/>
+        </w:rPr>
+        <w:t xml:space="preserve">tail - whether or not the species has a wing </w:t>
+      </w:r>
+      <w:proofErr w:type="gramStart"/>
+      <w:r>
+        <w:rPr>
+          <w:lang w:val="en-CA"/>
+        </w:rPr>
+        <w:t>tail</w:t>
+      </w:r>
+      <w:proofErr w:type="gramEnd"/>
+    </w:p>
+    <w:p>
+      <w:pPr>
+        <w:rPr>
+          <w:lang w:val="en-CA"/>
+        </w:rPr>
+      </w:pPr>
+      <w:r>
+        <w:rPr>
+          <w:lang w:val="en-CA"/>
+        </w:rPr>
+        <w:t xml:space="preserve">band - whether or not the species has a banding feature on its </w:t>
+      </w:r>
+      <w:proofErr w:type="gramStart"/>
+      <w:r>
+        <w:rPr>
+          <w:lang w:val="en-CA"/>
+        </w:rPr>
+        <w:t>wing</w:t>
+      </w:r>
+      <w:proofErr w:type="gramEnd"/>
+    </w:p>
+    <w:p>
+      <w:pPr>
+        <w:rPr>
+          <w:lang w:val="en-CA"/>
+        </w:rPr>
+      </w:pPr>
+      <w:r>
+        <w:rPr>
+          <w:lang w:val="en-CA"/>
+        </w:rPr>
+        <w:t xml:space="preserve">spot - whether or not the species has a spot feature on its </w:t>
+      </w:r>
+      <w:proofErr w:type="gramStart"/>
+      <w:r>
+        <w:rPr>
+          <w:lang w:val="en-CA"/>
+        </w:rPr>
+        <w:t>wing</w:t>
+      </w:r>
+      <w:proofErr w:type="gramEnd"/>
     </w:p>
     <w:p>
       <w:pPr>
@@ -895,6 +1236,7 @@
         <w:rPr>
           <w:lang w:val="en-CA"/>
         </w:rPr>
+        <w:lastRenderedPageBreak/>
         <w:t>genus</w:t>
       </w:r>
       <w:r>
@@ -1051,9 +1393,17 @@
         <w:rPr>
           <w:lang w:val="en-CA"/>
         </w:rPr>
-        <w:t>total_detections</w:t>
-      </w:r>
-      <w:proofErr w:type="spellEnd"/>
+        <w:t>total_</w:t>
+      </w:r>
+      <w:proofErr w:type="gramStart"/>
+      <w:r>
+        <w:rPr>
+          <w:lang w:val="en-CA"/>
+        </w:rPr>
+        <w:t>detections</w:t>
+      </w:r>
+      <w:proofErr w:type="spellEnd"/>
+      <w:proofErr w:type="gramEnd"/>
     </w:p>
     <w:p>
       <w:pPr>
@@ -1076,6 +1426,7 @@
         <w:t xml:space="preserve"> - date (</w:t>
       </w:r>
       <w:proofErr w:type="spellStart"/>
+      <w:proofErr w:type="gramStart"/>
       <w:r>
         <w:rPr>
           <w:lang w:val="en-CA"/>
@@ -1083,6 +1434,7 @@
         <w:t>month.day.year</w:t>
       </w:r>
       <w:proofErr w:type="spellEnd"/>
+      <w:proofErr w:type="gramEnd"/>
       <w:r>
         <w:rPr>
           <w:lang w:val="en-CA"/>
@@ -1130,7 +1482,6 @@
           <w:bCs/>
           <w:lang w:val="en-CA"/>
         </w:rPr>
-        <w:lastRenderedPageBreak/>
         <w:t>#---------------------------------------------------------------------------------------------------------------------------</w:t>
       </w:r>
     </w:p>
@@ -1254,7 +1605,7 @@
           <w:lang w:val="en-CA"/>
         </w:rPr>
       </w:pPr>
-      <w:hyperlink r:id="rId6" w:history="1">
+      <w:hyperlink r:id="rId7" w:history="1">
         <w:r>
           <w:rPr>
             <w:rStyle w:val="Hyperlink"/>

</xml_diff>

<commit_message>
working on cleaning up and adding better commenting
</commit_message>
<xml_diff>
--- a/data/metadata.docx
+++ b/data/metadata.docx
@@ -1,6 +1,6 @@
 
 <file path=word/document.xml><?xml version="1.0" encoding="utf-8"?>
-<w:document xmlns:wpc="http://schemas.microsoft.com/office/word/2010/wordprocessingCanvas" xmlns:cx="http://schemas.microsoft.com/office/drawing/2014/chartex" xmlns:cx1="http://schemas.microsoft.com/office/drawing/2015/9/8/chartex" xmlns:cx2="http://schemas.microsoft.com/office/drawing/2015/10/21/chartex" xmlns:cx3="http://schemas.microsoft.com/office/drawing/2016/5/9/chartex" xmlns:cx4="http://schemas.microsoft.com/office/drawing/2016/5/10/chartex" xmlns:cx5="http://schemas.microsoft.com/office/drawing/2016/5/11/chartex" xmlns:cx6="http://schemas.microsoft.com/office/drawing/2016/5/12/chartex" xmlns:cx7="http://schemas.microsoft.com/office/drawing/2016/5/13/chartex" xmlns:cx8="http://schemas.microsoft.com/office/drawing/2016/5/14/chartex" xmlns:mc="http://schemas.openxmlformats.org/markup-compatibility/2006" xmlns:aink="http://schemas.microsoft.com/office/drawing/2016/ink" xmlns:am3d="http://schemas.microsoft.com/office/drawing/2017/model3d" xmlns:o="urn:schemas-microsoft-com:office:office" xmlns:oel="http://schemas.microsoft.com/office/2019/extlst" xmlns:r="http://schemas.openxmlformats.org/officeDocument/2006/relationships" xmlns:m="http://schemas.openxmlformats.org/officeDocument/2006/math" xmlns:v="urn:schemas-microsoft-com:vml" xmlns:wp14="http://schemas.microsoft.com/office/word/2010/wordprocessingDrawing" xmlns:wp="http://schemas.openxmlformats.org/drawingml/2006/wordprocessingDrawing" xmlns:w10="urn:schemas-microsoft-com:office:word" xmlns:w="http://schemas.openxmlformats.org/wordprocessingml/2006/main" xmlns:w14="http://schemas.microsoft.com/office/word/2010/wordml" xmlns:w15="http://schemas.microsoft.com/office/word/2012/wordml" xmlns:w16cex="http://schemas.microsoft.com/office/word/2018/wordml/cex" xmlns:w16cid="http://schemas.microsoft.com/office/word/2016/wordml/cid" xmlns:w16="http://schemas.microsoft.com/office/word/2018/wordml" xmlns:w16du="http://schemas.microsoft.com/office/word/2023/wordml/word16du" xmlns:w16sdtdh="http://schemas.microsoft.com/office/word/2020/wordml/sdtdatahash" xmlns:w16se="http://schemas.microsoft.com/office/word/2015/wordml/symex" xmlns:wpg="http://schemas.microsoft.com/office/word/2010/wordprocessingGroup" xmlns:wpi="http://schemas.microsoft.com/office/word/2010/wordprocessingInk" xmlns:wne="http://schemas.microsoft.com/office/word/2006/wordml" xmlns:wps="http://schemas.microsoft.com/office/word/2010/wordprocessingShape" mc:Ignorable="w14 w15 w16se w16cid w16 w16cex w16sdtdh w16du wp14">
+<w:document xmlns:wpc="http://schemas.microsoft.com/office/word/2010/wordprocessingCanvas" xmlns:cx="http://schemas.microsoft.com/office/drawing/2014/chartex" xmlns:cx1="http://schemas.microsoft.com/office/drawing/2015/9/8/chartex" xmlns:cx2="http://schemas.microsoft.com/office/drawing/2015/10/21/chartex" xmlns:cx3="http://schemas.microsoft.com/office/drawing/2016/5/9/chartex" xmlns:cx4="http://schemas.microsoft.com/office/drawing/2016/5/10/chartex" xmlns:cx5="http://schemas.microsoft.com/office/drawing/2016/5/11/chartex" xmlns:cx6="http://schemas.microsoft.com/office/drawing/2016/5/12/chartex" xmlns:cx7="http://schemas.microsoft.com/office/drawing/2016/5/13/chartex" xmlns:cx8="http://schemas.microsoft.com/office/drawing/2016/5/14/chartex" xmlns:mc="http://schemas.openxmlformats.org/markup-compatibility/2006" xmlns:aink="http://schemas.microsoft.com/office/drawing/2016/ink" xmlns:am3d="http://schemas.microsoft.com/office/drawing/2017/model3d" xmlns:o="urn:schemas-microsoft-com:office:office" xmlns:oel="http://schemas.microsoft.com/office/2019/extlst" xmlns:r="http://schemas.openxmlformats.org/officeDocument/2006/relationships" xmlns:m="http://schemas.openxmlformats.org/officeDocument/2006/math" xmlns:v="urn:schemas-microsoft-com:vml" xmlns:wp14="http://schemas.microsoft.com/office/word/2010/wordprocessingDrawing" xmlns:wp="http://schemas.openxmlformats.org/drawingml/2006/wordprocessingDrawing" xmlns:w10="urn:schemas-microsoft-com:office:word" xmlns:w="http://schemas.openxmlformats.org/wordprocessingml/2006/main" xmlns:w14="http://schemas.microsoft.com/office/word/2010/wordml" xmlns:w15="http://schemas.microsoft.com/office/word/2012/wordml" xmlns:w16cex="http://schemas.microsoft.com/office/word/2018/wordml/cex" xmlns:w16cid="http://schemas.microsoft.com/office/word/2016/wordml/cid" xmlns:w16="http://schemas.microsoft.com/office/word/2018/wordml" xmlns:w16du="http://schemas.microsoft.com/office/word/2023/wordml/word16du" xmlns:w16sdtdh="http://schemas.microsoft.com/office/word/2020/wordml/sdtdatahash" xmlns:w16sdtfl="http://schemas.microsoft.com/office/word/2024/wordml/sdtformatlock" xmlns:w16se="http://schemas.microsoft.com/office/word/2015/wordml/symex" xmlns:wpg="http://schemas.microsoft.com/office/word/2010/wordprocessingGroup" xmlns:wpi="http://schemas.microsoft.com/office/word/2010/wordprocessingInk" xmlns:wne="http://schemas.microsoft.com/office/word/2006/wordml" xmlns:wps="http://schemas.microsoft.com/office/word/2010/wordprocessingShape" mc:Ignorable="w14 w15 w16se w16cid w16 w16cex w16sdtdh w16sdtfl w16du wp14">
   <w:body>
     <w:p>
       <w:pPr>
@@ -12,7 +12,92 @@
         <w:rPr>
           <w:lang w:val="en-CA"/>
         </w:rPr>
-        <w:t>Metadata for species trait data</w:t>
+        <w:t xml:space="preserve">Metadata for </w:t>
+      </w:r>
+      <w:r>
+        <w:rPr>
+          <w:lang w:val="en-CA"/>
+        </w:rPr>
+        <w:t>“</w:t>
+      </w:r>
+      <w:r>
+        <w:rPr>
+          <w:lang w:val="en-CA"/>
+        </w:rPr>
+        <w:t>Community science synthesis reveals consistent positive effects of park size and tree cover on butterfly diversity across 22 major US cities</w:t>
+      </w:r>
+      <w:r>
+        <w:rPr>
+          <w:lang w:val="en-CA"/>
+        </w:rPr>
+        <w:t>”</w:t>
+      </w:r>
+    </w:p>
+    <w:p>
+      <w:pPr>
+        <w:rPr>
+          <w:lang w:val="en-CA"/>
+        </w:rPr>
+      </w:pPr>
+      <w:r>
+        <w:rPr>
+          <w:lang w:val="en-CA"/>
+        </w:rPr>
+        <w:t>Updated June 3, 2026</w:t>
+      </w:r>
+    </w:p>
+    <w:p>
+      <w:pPr>
+        <w:rPr>
+          <w:lang w:val="en-CA"/>
+        </w:rPr>
+      </w:pPr>
+      <w:r>
+        <w:rPr>
+          <w:lang w:val="en-CA"/>
+        </w:rPr>
+        <w:t>Jens Ulrich</w:t>
+      </w:r>
+    </w:p>
+    <w:p>
+      <w:pPr>
+        <w:rPr>
+          <w:lang w:val="en-CA"/>
+        </w:rPr>
+      </w:pPr>
+      <w:r>
+        <w:rPr>
+          <w:lang w:val="en-CA"/>
+        </w:rPr>
+        <w:t xml:space="preserve">Within the </w:t>
+      </w:r>
+      <w:proofErr w:type="spellStart"/>
+      <w:r>
+        <w:rPr>
+          <w:lang w:val="en-CA"/>
+        </w:rPr>
+        <w:t>github</w:t>
+      </w:r>
+      <w:proofErr w:type="spellEnd"/>
+      <w:r>
+        <w:rPr>
+          <w:lang w:val="en-CA"/>
+        </w:rPr>
+        <w:t xml:space="preserve"> directory, data are contained within the </w:t>
+      </w:r>
+      <w:proofErr w:type="gramStart"/>
+      <w:r>
+        <w:rPr>
+          <w:lang w:val="en-CA"/>
+        </w:rPr>
+        <w:t>“./</w:t>
+      </w:r>
+      <w:proofErr w:type="gramEnd"/>
+      <w:r>
+        <w:rPr>
+          <w:lang w:val="en-CA"/>
+        </w:rPr>
+        <w:t xml:space="preserve">data” folder. The subfolders contain data as described below. </w:t>
       </w:r>
     </w:p>
     <w:p>
@@ -40,21 +125,862 @@
           <w:lang w:val="en-CA"/>
         </w:rPr>
       </w:pPr>
-      <w:r>
-        <w:rPr>
-          <w:b/>
-          <w:bCs/>
-          <w:lang w:val="en-CA"/>
-        </w:rPr>
-        <w:t>./data/lepidoptera_trait_data/</w:t>
-      </w:r>
-      <w:r>
-        <w:rPr>
-          <w:b/>
-          <w:bCs/>
-          <w:lang w:val="en-CA"/>
-        </w:rPr>
-        <w:t>lepidoptera_trait_data/SpeciesListForTraits</w:t>
+      <w:proofErr w:type="gramStart"/>
+      <w:r>
+        <w:rPr>
+          <w:b/>
+          <w:bCs/>
+          <w:lang w:val="en-CA"/>
+        </w:rPr>
+        <w:t># .</w:t>
+      </w:r>
+      <w:proofErr w:type="gramEnd"/>
+      <w:r>
+        <w:rPr>
+          <w:b/>
+          <w:bCs/>
+          <w:lang w:val="en-CA"/>
+        </w:rPr>
+        <w:t>/data/</w:t>
+      </w:r>
+      <w:proofErr w:type="spellStart"/>
+      <w:r>
+        <w:rPr>
+          <w:b/>
+          <w:bCs/>
+          <w:lang w:val="en-CA"/>
+        </w:rPr>
+        <w:t>buffer_around_parks</w:t>
+      </w:r>
+      <w:proofErr w:type="spellEnd"/>
+      <w:r>
+        <w:rPr>
+          <w:b/>
+          <w:bCs/>
+          <w:lang w:val="en-CA"/>
+        </w:rPr>
+        <w:t>/2km_park_buffer/</w:t>
+      </w:r>
+    </w:p>
+    <w:p>
+      <w:pPr>
+        <w:rPr>
+          <w:lang w:val="en-CA"/>
+        </w:rPr>
+      </w:pPr>
+      <w:r>
+        <w:rPr>
+          <w:lang w:val="en-CA"/>
+        </w:rPr>
+        <w:t xml:space="preserve">We calculated land cover within a 2km buffer surrounding each park (see </w:t>
+      </w:r>
+      <w:proofErr w:type="gramStart"/>
+      <w:r>
+        <w:rPr>
+          <w:lang w:val="en-CA"/>
+        </w:rPr>
+        <w:t>“./</w:t>
+      </w:r>
+      <w:proofErr w:type="spellStart"/>
+      <w:proofErr w:type="gramEnd"/>
+      <w:r>
+        <w:rPr>
+          <w:lang w:val="en-CA"/>
+        </w:rPr>
+        <w:t>data_wrangling</w:t>
+      </w:r>
+      <w:proofErr w:type="spellEnd"/>
+      <w:r>
+        <w:rPr>
+          <w:lang w:val="en-CA"/>
+        </w:rPr>
+        <w:t>/</w:t>
+      </w:r>
+      <w:r>
+        <w:rPr>
+          <w:lang w:val="en-CA"/>
+        </w:rPr>
+        <w:t>03_land_cover_and_</w:t>
+      </w:r>
+      <w:proofErr w:type="gramStart"/>
+      <w:r>
+        <w:rPr>
+          <w:lang w:val="en-CA"/>
+        </w:rPr>
+        <w:t>buffer.R</w:t>
+      </w:r>
+      <w:proofErr w:type="gramEnd"/>
+      <w:r>
+        <w:rPr>
+          <w:lang w:val="en-CA"/>
+        </w:rPr>
+        <w:t>”. We created a unique .csv file containing the park-level landscape buffer data for each city. The land cover data are as follows:</w:t>
+      </w:r>
+    </w:p>
+    <w:p>
+      <w:pPr>
+        <w:rPr>
+          <w:lang w:val="en-CA"/>
+        </w:rPr>
+      </w:pPr>
+      <w:proofErr w:type="spellStart"/>
+      <w:r>
+        <w:rPr>
+          <w:lang w:val="en-CA"/>
+        </w:rPr>
+        <w:t>ParkID</w:t>
+      </w:r>
+      <w:proofErr w:type="spellEnd"/>
+      <w:r>
+        <w:rPr>
+          <w:lang w:val="en-CA"/>
+        </w:rPr>
+        <w:t xml:space="preserve"> – </w:t>
+      </w:r>
+      <w:proofErr w:type="gramStart"/>
+      <w:r>
+        <w:rPr>
+          <w:lang w:val="en-CA"/>
+        </w:rPr>
+        <w:t>Unique park</w:t>
+      </w:r>
+      <w:proofErr w:type="gramEnd"/>
+      <w:r>
+        <w:rPr>
+          <w:lang w:val="en-CA"/>
+        </w:rPr>
+        <w:t xml:space="preserve"> identifier assigned by the original park shapefile provided by </w:t>
+      </w:r>
+      <w:proofErr w:type="spellStart"/>
+      <w:r>
+        <w:rPr>
+          <w:lang w:val="en-CA"/>
+        </w:rPr>
+        <w:t>ParkServe</w:t>
+      </w:r>
+      <w:proofErr w:type="spellEnd"/>
+      <w:r>
+        <w:rPr>
+          <w:lang w:val="en-CA"/>
+        </w:rPr>
+        <w:t xml:space="preserve">. </w:t>
+      </w:r>
+    </w:p>
+    <w:p>
+      <w:pPr>
+        <w:rPr>
+          <w:lang w:val="en-CA"/>
+        </w:rPr>
+      </w:pPr>
+      <w:proofErr w:type="spellStart"/>
+      <w:r>
+        <w:rPr>
+          <w:lang w:val="en-CA"/>
+        </w:rPr>
+        <w:t>New_id</w:t>
+      </w:r>
+      <w:proofErr w:type="spellEnd"/>
+      <w:r>
+        <w:rPr>
+          <w:lang w:val="en-CA"/>
+        </w:rPr>
+        <w:t xml:space="preserve"> – Unique (within-city) integer park identifier.</w:t>
+      </w:r>
+    </w:p>
+    <w:p>
+      <w:pPr>
+        <w:rPr>
+          <w:lang w:val="en-CA"/>
+        </w:rPr>
+      </w:pPr>
+      <w:proofErr w:type="spellStart"/>
+      <w:r>
+        <w:rPr>
+          <w:lang w:val="en-CA"/>
+        </w:rPr>
+        <w:t>ParkCount</w:t>
+      </w:r>
+      <w:proofErr w:type="spellEnd"/>
+      <w:r>
+        <w:rPr>
+          <w:lang w:val="en-CA"/>
+        </w:rPr>
+        <w:t xml:space="preserve"> – the number of smaller shapefiles that were merged into a single park polygon.</w:t>
+      </w:r>
+    </w:p>
+    <w:p>
+      <w:pPr>
+        <w:rPr>
+          <w:lang w:val="en-CA"/>
+        </w:rPr>
+      </w:pPr>
+      <w:r>
+        <w:rPr>
+          <w:lang w:val="en-CA"/>
+        </w:rPr>
+        <w:t xml:space="preserve">Type – “Classified” indicates that the park has some area within the administrative boundary of the city, as defined by the </w:t>
+      </w:r>
+      <w:proofErr w:type="spellStart"/>
+      <w:r>
+        <w:rPr>
+          <w:lang w:val="en-CA"/>
+        </w:rPr>
+        <w:t>UrbanWatch</w:t>
+      </w:r>
+      <w:proofErr w:type="spellEnd"/>
+      <w:r>
+        <w:rPr>
+          <w:lang w:val="en-CA"/>
+        </w:rPr>
+        <w:t xml:space="preserve"> dataset.</w:t>
+      </w:r>
+    </w:p>
+    <w:p>
+      <w:pPr>
+        <w:rPr>
+          <w:rFonts w:eastAsia="Times New Roman" w:cs="Times New Roman"/>
+          <w:color w:val="000000"/>
+          <w:kern w:val="0"/>
+          <w14:ligatures w14:val="none"/>
+        </w:rPr>
+      </w:pPr>
+      <w:proofErr w:type="spellStart"/>
+      <w:r>
+        <w:rPr>
+          <w:rFonts w:eastAsia="Times New Roman" w:cs="Times New Roman"/>
+          <w:color w:val="000000"/>
+          <w:kern w:val="0"/>
+          <w14:ligatures w14:val="none"/>
+        </w:rPr>
+        <w:t>total_sur_area_sqm</w:t>
+      </w:r>
+      <w:proofErr w:type="spellEnd"/>
+      <w:r>
+        <w:rPr>
+          <w:rFonts w:eastAsia="Times New Roman" w:cs="Times New Roman"/>
+          <w:color w:val="000000"/>
+          <w:kern w:val="0"/>
+          <w14:ligatures w14:val="none"/>
+        </w:rPr>
+        <w:t xml:space="preserve"> – total surface area of the park polygon in meters squared.</w:t>
+      </w:r>
+    </w:p>
+    <w:p>
+      <w:pPr>
+        <w:spacing w:after="0" w:line="240" w:lineRule="auto"/>
+        <w:rPr>
+          <w:rFonts w:eastAsia="Times New Roman" w:cs="Times New Roman"/>
+          <w:color w:val="000000"/>
+          <w:kern w:val="0"/>
+          <w14:ligatures w14:val="none"/>
+        </w:rPr>
+      </w:pPr>
+      <w:r>
+        <w:rPr>
+          <w:rFonts w:eastAsia="Times New Roman" w:cs="Times New Roman"/>
+          <w:color w:val="000000"/>
+          <w:kern w:val="0"/>
+          <w14:ligatures w14:val="none"/>
+        </w:rPr>
+        <w:t xml:space="preserve">Columns </w:t>
+      </w:r>
+      <w:proofErr w:type="gramStart"/>
+      <w:r>
+        <w:rPr>
+          <w:rFonts w:eastAsia="Times New Roman" w:cs="Times New Roman"/>
+          <w:color w:val="000000"/>
+          <w:kern w:val="0"/>
+          <w14:ligatures w14:val="none"/>
+        </w:rPr>
+        <w:t>6 :</w:t>
+      </w:r>
+      <w:proofErr w:type="gramEnd"/>
+      <w:r>
+        <w:rPr>
+          <w:rFonts w:eastAsia="Times New Roman" w:cs="Times New Roman"/>
+          <w:color w:val="000000"/>
+          <w:kern w:val="0"/>
+          <w14:ligatures w14:val="none"/>
+        </w:rPr>
+        <w:t xml:space="preserve"> 21 – these columns contain the area in meters squared of each land cover class defined by the NLCD dataset within the 2km buffer of the park polygon. See the annual NLCD land cover data descriptions for further information. We used annual land cover data from 2024. </w:t>
+      </w:r>
+      <w:hyperlink r:id="rId4" w:history="1">
+        <w:r>
+          <w:rPr>
+            <w:rStyle w:val="Hyperlink"/>
+            <w:rFonts w:eastAsia="Times New Roman" w:cs="Times New Roman"/>
+            <w:kern w:val="0"/>
+            <w14:ligatures w14:val="none"/>
+          </w:rPr>
+          <w:t>https://www.usgs.gov/centers/eros/science/national-land-cover-database</w:t>
+        </w:r>
+      </w:hyperlink>
+    </w:p>
+    <w:p>
+      <w:pPr>
+        <w:spacing w:after="0" w:line="240" w:lineRule="auto"/>
+        <w:rPr>
+          <w:rFonts w:eastAsia="Times New Roman" w:cs="Times New Roman"/>
+          <w:color w:val="000000"/>
+          <w:kern w:val="0"/>
+          <w14:ligatures w14:val="none"/>
+        </w:rPr>
+      </w:pPr>
+    </w:p>
+    <w:p>
+      <w:pPr>
+        <w:spacing w:after="0" w:line="240" w:lineRule="auto"/>
+        <w:rPr>
+          <w:rFonts w:eastAsia="Times New Roman" w:cs="Times New Roman"/>
+          <w:color w:val="000000"/>
+          <w:kern w:val="0"/>
+          <w14:ligatures w14:val="none"/>
+        </w:rPr>
+      </w:pPr>
+      <w:proofErr w:type="spellStart"/>
+      <w:r>
+        <w:rPr>
+          <w:rFonts w:eastAsia="Times New Roman" w:cs="Times New Roman"/>
+          <w:color w:val="000000"/>
+          <w:kern w:val="0"/>
+          <w14:ligatures w14:val="none"/>
+        </w:rPr>
+        <w:t>Landcover_type_diversity</w:t>
+      </w:r>
+      <w:proofErr w:type="spellEnd"/>
+      <w:r>
+        <w:rPr>
+          <w:rFonts w:eastAsia="Times New Roman" w:cs="Times New Roman"/>
+          <w:color w:val="000000"/>
+          <w:kern w:val="0"/>
+          <w14:ligatures w14:val="none"/>
+        </w:rPr>
+        <w:t xml:space="preserve"> – the number of land cover classes present in the park buffer area (i.e., number of class columns with an area &gt; 0).</w:t>
+      </w:r>
+    </w:p>
+    <w:p>
+      <w:pPr>
+        <w:rPr>
+          <w:lang w:val="en-CA"/>
+        </w:rPr>
+      </w:pPr>
+    </w:p>
+    <w:p>
+      <w:pPr>
+        <w:rPr>
+          <w:b/>
+          <w:bCs/>
+          <w:lang w:val="en-CA"/>
+        </w:rPr>
+      </w:pPr>
+      <w:r>
+        <w:rPr>
+          <w:b/>
+          <w:bCs/>
+          <w:lang w:val="en-CA"/>
+        </w:rPr>
+        <w:t>#---------------------------------------------------------------------------------------------------------------------------</w:t>
+      </w:r>
+    </w:p>
+    <w:p>
+      <w:pPr>
+        <w:rPr>
+          <w:b/>
+          <w:bCs/>
+          <w:lang w:val="en-CA"/>
+        </w:rPr>
+      </w:pPr>
+      <w:proofErr w:type="gramStart"/>
+      <w:r>
+        <w:rPr>
+          <w:b/>
+          <w:bCs/>
+          <w:lang w:val="en-CA"/>
+        </w:rPr>
+        <w:t># .</w:t>
+      </w:r>
+      <w:proofErr w:type="gramEnd"/>
+      <w:r>
+        <w:rPr>
+          <w:b/>
+          <w:bCs/>
+          <w:lang w:val="en-CA"/>
+        </w:rPr>
+        <w:t>/data/</w:t>
+      </w:r>
+      <w:proofErr w:type="spellStart"/>
+      <w:r>
+        <w:rPr>
+          <w:b/>
+          <w:bCs/>
+          <w:lang w:val="en-CA"/>
+        </w:rPr>
+        <w:t>city_shapefiles</w:t>
+      </w:r>
+      <w:proofErr w:type="spellEnd"/>
+      <w:r>
+        <w:rPr>
+          <w:b/>
+          <w:bCs/>
+          <w:lang w:val="en-CA"/>
+        </w:rPr>
+        <w:t>/</w:t>
+      </w:r>
+    </w:p>
+    <w:p>
+      <w:pPr>
+        <w:rPr>
+          <w:lang w:val="en-CA"/>
+        </w:rPr>
+      </w:pPr>
+      <w:r>
+        <w:rPr>
+          <w:lang w:val="en-CA"/>
+        </w:rPr>
+        <w:t>Within this folder “</w:t>
+      </w:r>
+      <w:proofErr w:type="spellStart"/>
+      <w:r>
+        <w:rPr>
+          <w:lang w:val="en-CA"/>
+        </w:rPr>
+        <w:t>park_classification_cityname.rds</w:t>
+      </w:r>
+      <w:proofErr w:type="spellEnd"/>
+      <w:r>
+        <w:rPr>
+          <w:lang w:val="en-CA"/>
+        </w:rPr>
+        <w:t xml:space="preserve">” files contain an R readable shapefile with city parks. “Classified” parks are the parks that overlap with the city administrative boundary defined by </w:t>
+      </w:r>
+      <w:proofErr w:type="spellStart"/>
+      <w:r>
+        <w:rPr>
+          <w:lang w:val="en-CA"/>
+        </w:rPr>
+        <w:t>UrbanWatch</w:t>
+      </w:r>
+      <w:proofErr w:type="spellEnd"/>
+      <w:r>
+        <w:rPr>
+          <w:lang w:val="en-CA"/>
+        </w:rPr>
+        <w:t>. I don’t think we need the actual shapefiles in this folder that are there for a couple of cities?</w:t>
+      </w:r>
+    </w:p>
+    <w:p>
+      <w:pPr>
+        <w:rPr>
+          <w:b/>
+          <w:bCs/>
+          <w:lang w:val="en-CA"/>
+        </w:rPr>
+      </w:pPr>
+      <w:r>
+        <w:rPr>
+          <w:b/>
+          <w:bCs/>
+          <w:lang w:val="en-CA"/>
+        </w:rPr>
+        <w:t>#---------------------------------------------------------------------------------------------------------------------------</w:t>
+      </w:r>
+    </w:p>
+    <w:p>
+      <w:pPr>
+        <w:rPr>
+          <w:b/>
+          <w:bCs/>
+          <w:lang w:val="en-CA"/>
+        </w:rPr>
+      </w:pPr>
+      <w:proofErr w:type="gramStart"/>
+      <w:r>
+        <w:rPr>
+          <w:b/>
+          <w:bCs/>
+          <w:lang w:val="en-CA"/>
+        </w:rPr>
+        <w:t># .</w:t>
+      </w:r>
+      <w:proofErr w:type="gramEnd"/>
+      <w:r>
+        <w:rPr>
+          <w:b/>
+          <w:bCs/>
+          <w:lang w:val="en-CA"/>
+        </w:rPr>
+        <w:t>/data/</w:t>
+      </w:r>
+      <w:proofErr w:type="spellStart"/>
+      <w:r>
+        <w:rPr>
+          <w:b/>
+          <w:bCs/>
+          <w:lang w:val="en-CA"/>
+        </w:rPr>
+        <w:t>city_</w:t>
+      </w:r>
+      <w:r>
+        <w:rPr>
+          <w:b/>
+          <w:bCs/>
+          <w:lang w:val="en-CA"/>
+        </w:rPr>
+        <w:t>wide_data</w:t>
+      </w:r>
+      <w:proofErr w:type="spellEnd"/>
+      <w:r>
+        <w:rPr>
+          <w:b/>
+          <w:bCs/>
+          <w:lang w:val="en-CA"/>
+        </w:rPr>
+        <w:t>/</w:t>
+      </w:r>
+    </w:p>
+    <w:p>
+      <w:pPr>
+        <w:rPr>
+          <w:lang w:val="en-CA"/>
+        </w:rPr>
+      </w:pPr>
+      <w:r>
+        <w:rPr>
+          <w:lang w:val="en-CA"/>
+        </w:rPr>
+        <w:t>This folder contains processed data describing city-wide attributes</w:t>
+      </w:r>
+      <w:r>
+        <w:rPr>
+          <w:lang w:val="en-CA"/>
+        </w:rPr>
+        <w:t>. Each file contains a row for each of the 22 cities in our study</w:t>
+      </w:r>
+      <w:r>
+        <w:rPr>
+          <w:lang w:val="en-CA"/>
+        </w:rPr>
+        <w:t xml:space="preserve">. The data are spread across the following files: </w:t>
+      </w:r>
+    </w:p>
+    <w:p>
+      <w:pPr>
+        <w:rPr>
+          <w:lang w:val="en-CA"/>
+        </w:rPr>
+      </w:pPr>
+      <w:r>
+        <w:rPr>
+          <w:lang w:val="en-CA"/>
+        </w:rPr>
+        <w:lastRenderedPageBreak/>
+        <w:t>01_urbanwatch_city_wide_land_cover_area_diversity</w:t>
+      </w:r>
+      <w:r>
+        <w:rPr>
+          <w:lang w:val="en-CA"/>
+        </w:rPr>
+        <w:t>.csv</w:t>
+      </w:r>
+      <w:r>
+        <w:rPr>
+          <w:lang w:val="en-CA"/>
+        </w:rPr>
+        <w:t xml:space="preserve"> – columns contain the area (meters sq) of each of the 8 land cover categories described by </w:t>
+      </w:r>
+      <w:proofErr w:type="spellStart"/>
+      <w:r>
+        <w:rPr>
+          <w:lang w:val="en-CA"/>
+        </w:rPr>
+        <w:t>UrbanWatch</w:t>
+      </w:r>
+      <w:proofErr w:type="spellEnd"/>
+      <w:r>
+        <w:rPr>
+          <w:lang w:val="en-CA"/>
+        </w:rPr>
+        <w:t xml:space="preserve">, as well as the total area of the city (meters sq) as defined by </w:t>
+      </w:r>
+      <w:proofErr w:type="spellStart"/>
+      <w:r>
+        <w:rPr>
+          <w:lang w:val="en-CA"/>
+        </w:rPr>
+        <w:t>UrbanWatch</w:t>
+      </w:r>
+      <w:proofErr w:type="spellEnd"/>
+      <w:r>
+        <w:rPr>
+          <w:lang w:val="en-CA"/>
+        </w:rPr>
+        <w:t>.</w:t>
+      </w:r>
+    </w:p>
+    <w:p>
+      <w:pPr>
+        <w:rPr>
+          <w:lang w:val="en-CA"/>
+        </w:rPr>
+      </w:pPr>
+      <w:r>
+        <w:rPr>
+          <w:lang w:val="en-CA"/>
+        </w:rPr>
+        <w:t>02_urbanwatch_city_wide_connectivity_metrics_classified_parks_only</w:t>
+      </w:r>
+      <w:r>
+        <w:rPr>
+          <w:lang w:val="en-CA"/>
+        </w:rPr>
+        <w:t xml:space="preserve">.csv – columns contain the IIC metric (Integral Index of Connectivity) for the set of parks contained within each city. IIC was calculated using the </w:t>
+      </w:r>
+      <w:proofErr w:type="spellStart"/>
+      <w:proofErr w:type="gramStart"/>
+      <w:r>
+        <w:rPr>
+          <w:lang w:val="en-CA"/>
+        </w:rPr>
+        <w:t>lconnect</w:t>
+      </w:r>
+      <w:proofErr w:type="spellEnd"/>
+      <w:r>
+        <w:rPr>
+          <w:lang w:val="en-CA"/>
+        </w:rPr>
+        <w:t>(</w:t>
+      </w:r>
+      <w:proofErr w:type="gramEnd"/>
+      <w:r>
+        <w:rPr>
+          <w:lang w:val="en-CA"/>
+        </w:rPr>
+        <w:t xml:space="preserve">) package in R. </w:t>
+      </w:r>
+    </w:p>
+    <w:p>
+      <w:pPr>
+        <w:rPr>
+          <w:lang w:val="en-CA"/>
+        </w:rPr>
+      </w:pPr>
+      <w:proofErr w:type="gramStart"/>
+      <w:r>
+        <w:rPr>
+          <w:lang w:val="en-CA"/>
+        </w:rPr>
+        <w:t>03_20km_buffer_city_wide_land_cover_area_diversity</w:t>
+      </w:r>
+      <w:r>
+        <w:rPr>
+          <w:lang w:val="en-CA"/>
+        </w:rPr>
+        <w:t xml:space="preserve">.csv  </w:t>
+      </w:r>
+      <w:r>
+        <w:rPr>
+          <w:lang w:val="en-CA"/>
+        </w:rPr>
+        <w:t>–</w:t>
+      </w:r>
+      <w:proofErr w:type="gramEnd"/>
+      <w:r>
+        <w:rPr>
+          <w:lang w:val="en-CA"/>
+        </w:rPr>
+        <w:t xml:space="preserve"> </w:t>
+      </w:r>
+      <w:r>
+        <w:rPr>
+          <w:lang w:val="en-CA"/>
+        </w:rPr>
+        <w:t xml:space="preserve">columns contain the area (meters sq) of each of the land cover categories described by </w:t>
+      </w:r>
+      <w:r>
+        <w:rPr>
+          <w:lang w:val="en-CA"/>
+        </w:rPr>
+        <w:t>the NLCD land cover dataset within a 20km buffer surrounding each city.</w:t>
+      </w:r>
+    </w:p>
+    <w:p>
+      <w:pPr>
+        <w:rPr>
+          <w:lang w:val="en-CA"/>
+        </w:rPr>
+      </w:pPr>
+      <w:r>
+        <w:rPr>
+          <w:lang w:val="en-CA"/>
+        </w:rPr>
+        <w:t>04_city_wide_isolation_metrics</w:t>
+      </w:r>
+      <w:r>
+        <w:rPr>
+          <w:lang w:val="en-CA"/>
+        </w:rPr>
+        <w:t xml:space="preserve">.csv – this file contains the average park level isolation for all parks within the </w:t>
+      </w:r>
+      <w:proofErr w:type="spellStart"/>
+      <w:r>
+        <w:rPr>
+          <w:lang w:val="en-CA"/>
+        </w:rPr>
+        <w:t>UrbanWatch</w:t>
+      </w:r>
+      <w:proofErr w:type="spellEnd"/>
+      <w:r>
+        <w:rPr>
+          <w:lang w:val="en-CA"/>
+        </w:rPr>
+        <w:t xml:space="preserve"> city boundaries, as calculated using the area and distance weighted isolation metric provided in the text. Multiplying these values by (-1) transforms the value into average park connectivity.</w:t>
+      </w:r>
+    </w:p>
+    <w:p>
+      <w:pPr>
+        <w:rPr>
+          <w:lang w:val="en-CA"/>
+        </w:rPr>
+      </w:pPr>
+      <w:r>
+        <w:rPr>
+          <w:lang w:val="en-CA"/>
+        </w:rPr>
+        <w:t>05_all_cities_average_park_size_classified_parks_only</w:t>
+      </w:r>
+      <w:r>
+        <w:rPr>
+          <w:lang w:val="en-CA"/>
+        </w:rPr>
+        <w:t xml:space="preserve">.csv – describes the mean, median, mean (log), and median (log) size of all parks within the </w:t>
+      </w:r>
+      <w:proofErr w:type="spellStart"/>
+      <w:r>
+        <w:rPr>
+          <w:lang w:val="en-CA"/>
+        </w:rPr>
+        <w:t>UrbanWatch</w:t>
+      </w:r>
+      <w:proofErr w:type="spellEnd"/>
+      <w:r>
+        <w:rPr>
+          <w:lang w:val="en-CA"/>
+        </w:rPr>
+        <w:t xml:space="preserve"> city boundaries. Park size was quantified as the total vegetated area of a park polygon contained within the city boundary.</w:t>
+      </w:r>
+    </w:p>
+    <w:p>
+      <w:pPr>
+        <w:rPr>
+          <w:b/>
+          <w:bCs/>
+          <w:lang w:val="en-CA"/>
+        </w:rPr>
+      </w:pPr>
+      <w:r>
+        <w:rPr>
+          <w:b/>
+          <w:bCs/>
+          <w:lang w:val="en-CA"/>
+        </w:rPr>
+        <w:t>#---------------------------------------------------------------------------------------------------------------------------</w:t>
+      </w:r>
+    </w:p>
+    <w:p>
+      <w:pPr>
+        <w:rPr>
+          <w:b/>
+          <w:bCs/>
+          <w:lang w:val="en-CA"/>
+        </w:rPr>
+      </w:pPr>
+      <w:proofErr w:type="gramStart"/>
+      <w:r>
+        <w:rPr>
+          <w:b/>
+          <w:bCs/>
+          <w:lang w:val="en-CA"/>
+        </w:rPr>
+        <w:t># .</w:t>
+      </w:r>
+      <w:proofErr w:type="gramEnd"/>
+      <w:r>
+        <w:rPr>
+          <w:b/>
+          <w:bCs/>
+          <w:lang w:val="en-CA"/>
+        </w:rPr>
+        <w:t>/data/</w:t>
+      </w:r>
+      <w:proofErr w:type="spellStart"/>
+      <w:r>
+        <w:rPr>
+          <w:b/>
+          <w:bCs/>
+          <w:lang w:val="en-CA"/>
+        </w:rPr>
+        <w:t>detections_by_city</w:t>
+      </w:r>
+      <w:proofErr w:type="spellEnd"/>
+      <w:r>
+        <w:rPr>
+          <w:b/>
+          <w:bCs/>
+          <w:lang w:val="en-CA"/>
+        </w:rPr>
+        <w:t>/</w:t>
+      </w:r>
+    </w:p>
+    <w:p>
+      <w:pPr>
+        <w:rPr>
+          <w:b/>
+          <w:bCs/>
+          <w:lang w:val="en-CA"/>
+        </w:rPr>
+      </w:pPr>
+    </w:p>
+    <w:p>
+      <w:pPr>
+        <w:rPr>
+          <w:b/>
+          <w:bCs/>
+          <w:lang w:val="en-CA"/>
+        </w:rPr>
+      </w:pPr>
+      <w:r>
+        <w:rPr>
+          <w:b/>
+          <w:bCs/>
+          <w:lang w:val="en-CA"/>
+        </w:rPr>
+        <w:t>#---------------------------------------------------------------------------------------------------------------------------</w:t>
+      </w:r>
+    </w:p>
+    <w:p>
+      <w:pPr>
+        <w:rPr>
+          <w:b/>
+          <w:bCs/>
+          <w:lang w:val="en-CA"/>
+        </w:rPr>
+      </w:pPr>
+    </w:p>
+    <w:p>
+      <w:pPr>
+        <w:rPr>
+          <w:b/>
+          <w:bCs/>
+          <w:lang w:val="en-CA"/>
+        </w:rPr>
+      </w:pPr>
+      <w:r>
+        <w:rPr>
+          <w:b/>
+          <w:bCs/>
+          <w:lang w:val="en-CA"/>
+        </w:rPr>
+        <w:t>./data/lepidoptera_trait_data/lepidoptera_trait_data/SpeciesListForTraits</w:t>
       </w:r>
       <w:r>
         <w:rPr>
@@ -170,7 +1096,7 @@
         </w:rPr>
         <w:t>by parsing the descriptions of each species from the Butterflies and Moths of North America (BAMONA) website (</w:t>
       </w:r>
-      <w:hyperlink r:id="rId4" w:history="1">
+      <w:hyperlink r:id="rId5" w:history="1">
         <w:r>
           <w:rPr>
             <w:rStyle w:val="Hyperlink"/>
@@ -236,7 +1162,7 @@
         </w:rPr>
         <w:t xml:space="preserve">from: </w:t>
       </w:r>
-      <w:hyperlink r:id="rId5" w:history="1">
+      <w:hyperlink r:id="rId6" w:history="1">
         <w:r>
           <w:rPr>
             <w:rStyle w:val="Hyperlink"/>
@@ -267,7 +1193,14 @@
         <w:rPr>
           <w:lang w:val="en-CA"/>
         </w:rPr>
-        <w:t>Logistical and preference bias in participatory science butterfly data</w:t>
+        <w:t xml:space="preserve">Logistical and preference bias in participatory science </w:t>
+      </w:r>
+      <w:r>
+        <w:rPr>
+          <w:lang w:val="en-CA"/>
+        </w:rPr>
+        <w:lastRenderedPageBreak/>
+        <w:t>butterfly data</w:t>
       </w:r>
       <w:r>
         <w:rPr>
@@ -275,7 +1208,7 @@
         </w:rPr>
         <w:t xml:space="preserve">” </w:t>
       </w:r>
-      <w:hyperlink r:id="rId6" w:history="1">
+      <w:hyperlink r:id="rId7" w:history="1">
         <w:r>
           <w:rPr>
             <w:rStyle w:val="Hyperlink"/>
@@ -339,21 +1272,7 @@
         <w:rPr>
           <w:lang w:val="en-CA"/>
         </w:rPr>
-        <w:t xml:space="preserve"> file contains a list of butterfly species considered for analysis. It is used for resolving taxonomy between </w:t>
-      </w:r>
-      <w:proofErr w:type="spellStart"/>
-      <w:r>
-        <w:rPr>
-          <w:lang w:val="en-CA"/>
-        </w:rPr>
-        <w:t>iNaturalist</w:t>
-      </w:r>
-      <w:proofErr w:type="spellEnd"/>
-      <w:r>
-        <w:rPr>
-          <w:lang w:val="en-CA"/>
-        </w:rPr>
-        <w:t xml:space="preserve">, </w:t>
+        <w:t xml:space="preserve"> file contains a list of butterfly species considered for analysis. It is used for resolving taxonomy between iNaturalist, </w:t>
       </w:r>
       <w:proofErr w:type="spellStart"/>
       <w:r>
@@ -479,30 +1398,8 @@
         <w:rPr>
           <w:lang w:val="en-CA"/>
         </w:rPr>
-        <w:t xml:space="preserve"> - the name or names of the species in </w:t>
-      </w:r>
-      <w:proofErr w:type="spellStart"/>
-      <w:r>
-        <w:rPr>
-          <w:lang w:val="en-CA"/>
-        </w:rPr>
-        <w:t>iNaturalist</w:t>
-      </w:r>
-      <w:proofErr w:type="spellEnd"/>
-      <w:r>
-        <w:rPr>
-          <w:lang w:val="en-CA"/>
-        </w:rPr>
-        <w:t xml:space="preserve">/GBIF, if those species appear in the "species" </w:t>
-      </w:r>
-      <w:proofErr w:type="gramStart"/>
-      <w:r>
-        <w:rPr>
-          <w:lang w:val="en-CA"/>
-        </w:rPr>
-        <w:t>field</w:t>
-      </w:r>
-      <w:proofErr w:type="gramEnd"/>
+        <w:t xml:space="preserve"> - the name or names of the species in iNaturalist/GBIF, if those species appear in the "species" field</w:t>
+      </w:r>
     </w:p>
     <w:p>
       <w:pPr>
@@ -522,21 +1419,7 @@
         <w:rPr>
           <w:lang w:val="en-CA"/>
         </w:rPr>
-        <w:t xml:space="preserve"> - the name or names of the species in </w:t>
-      </w:r>
-      <w:proofErr w:type="spellStart"/>
-      <w:r>
-        <w:rPr>
-          <w:lang w:val="en-CA"/>
-        </w:rPr>
-        <w:t>iNaturalist</w:t>
-      </w:r>
-      <w:proofErr w:type="spellEnd"/>
-      <w:r>
-        <w:rPr>
-          <w:lang w:val="en-CA"/>
-        </w:rPr>
-        <w:t>/GBIF, if those species appear in the "</w:t>
+        <w:t xml:space="preserve"> - the name or names of the species in iNaturalist/GBIF, if those species appear in the "</w:t>
       </w:r>
       <w:proofErr w:type="spellStart"/>
       <w:r>
@@ -550,16 +1433,8 @@
         <w:rPr>
           <w:lang w:val="en-CA"/>
         </w:rPr>
-        <w:t xml:space="preserve">" field of GBIF </w:t>
-      </w:r>
-      <w:proofErr w:type="gramStart"/>
-      <w:r>
-        <w:rPr>
-          <w:lang w:val="en-CA"/>
-        </w:rPr>
-        <w:t>data</w:t>
-      </w:r>
-      <w:proofErr w:type="gramEnd"/>
+        <w:t>" field of GBIF data</w:t>
+      </w:r>
     </w:p>
     <w:p>
       <w:pPr>
@@ -643,41 +1518,32 @@
           <w:iCs/>
           <w:lang w:val="en-CA"/>
         </w:rPr>
-        <w:t xml:space="preserve"> [note from Jens U. (5.8.2025): it appears that Goldstein et al. 2024 calculated this value by average the values of “WS_L” (lower </w:t>
-      </w:r>
+        <w:t xml:space="preserve"> [note from Jens U. (5.8.2025): it appears that Goldstein et al. 2024 calculated this value by average the values of “WS_L” (lower wingspan) and “WS_U” (upper wingspan) as listed in </w:t>
+      </w:r>
+      <w:proofErr w:type="spellStart"/>
       <w:r>
         <w:rPr>
           <w:i/>
           <w:iCs/>
           <w:lang w:val="en-CA"/>
         </w:rPr>
-        <w:lastRenderedPageBreak/>
-        <w:t xml:space="preserve">wingspan) and “WS_U” (upper wingspan) as listed in </w:t>
-      </w:r>
-      <w:proofErr w:type="spellStart"/>
+        <w:t>LepTraits</w:t>
+      </w:r>
+      <w:proofErr w:type="spellEnd"/>
       <w:r>
         <w:rPr>
           <w:i/>
           <w:iCs/>
           <w:lang w:val="en-CA"/>
         </w:rPr>
-        <w:t>LepTraits</w:t>
-      </w:r>
-      <w:proofErr w:type="spellEnd"/>
+        <w:t>. I performed the same calculation for any new species added to the dataset.</w:t>
+      </w:r>
       <w:r>
         <w:rPr>
           <w:i/>
           <w:iCs/>
           <w:lang w:val="en-CA"/>
         </w:rPr>
-        <w:t>. I performed the same calculation for any new species added to the dataset.</w:t>
-      </w:r>
-      <w:r>
-        <w:rPr>
-          <w:i/>
-          <w:iCs/>
-          <w:lang w:val="en-CA"/>
-        </w:rPr>
         <w:t>]</w:t>
       </w:r>
     </w:p>
@@ -691,352 +1557,455 @@
         <w:rPr>
           <w:lang w:val="en-CA"/>
         </w:rPr>
-        <w:t xml:space="preserve">black - whether or not the species has black on its </w:t>
+        <w:t xml:space="preserve">black - </w:t>
       </w:r>
       <w:proofErr w:type="gramStart"/>
       <w:r>
         <w:rPr>
           <w:lang w:val="en-CA"/>
         </w:rPr>
-        <w:t>wing</w:t>
+        <w:t>whether or not</w:t>
       </w:r>
       <w:proofErr w:type="gramEnd"/>
-    </w:p>
-    <w:p>
-      <w:pPr>
-        <w:rPr>
-          <w:lang w:val="en-CA"/>
-        </w:rPr>
-      </w:pPr>
-      <w:r>
-        <w:rPr>
-          <w:lang w:val="en-CA"/>
-        </w:rPr>
-        <w:t xml:space="preserve">gray - whether or not the species has gray on its </w:t>
+      <w:r>
+        <w:rPr>
+          <w:lang w:val="en-CA"/>
+        </w:rPr>
+        <w:t xml:space="preserve"> the species has black on its wing</w:t>
+      </w:r>
+    </w:p>
+    <w:p>
+      <w:pPr>
+        <w:rPr>
+          <w:lang w:val="en-CA"/>
+        </w:rPr>
+      </w:pPr>
+      <w:r>
+        <w:rPr>
+          <w:lang w:val="en-CA"/>
+        </w:rPr>
+        <w:t xml:space="preserve">gray - </w:t>
       </w:r>
       <w:proofErr w:type="gramStart"/>
       <w:r>
         <w:rPr>
           <w:lang w:val="en-CA"/>
         </w:rPr>
-        <w:t>wing</w:t>
+        <w:t>whether or not</w:t>
       </w:r>
       <w:proofErr w:type="gramEnd"/>
-    </w:p>
-    <w:p>
-      <w:pPr>
-        <w:rPr>
-          <w:lang w:val="en-CA"/>
-        </w:rPr>
-      </w:pPr>
-      <w:r>
-        <w:rPr>
-          <w:lang w:val="en-CA"/>
-        </w:rPr>
-        <w:t xml:space="preserve">white - whether or not the species has white on its </w:t>
+      <w:r>
+        <w:rPr>
+          <w:lang w:val="en-CA"/>
+        </w:rPr>
+        <w:t xml:space="preserve"> the species has gray on its wing</w:t>
+      </w:r>
+    </w:p>
+    <w:p>
+      <w:pPr>
+        <w:rPr>
+          <w:lang w:val="en-CA"/>
+        </w:rPr>
+      </w:pPr>
+      <w:r>
+        <w:rPr>
+          <w:lang w:val="en-CA"/>
+        </w:rPr>
+        <w:t xml:space="preserve">white - </w:t>
       </w:r>
       <w:proofErr w:type="gramStart"/>
       <w:r>
         <w:rPr>
           <w:lang w:val="en-CA"/>
         </w:rPr>
-        <w:t>wing</w:t>
+        <w:t>whether or not</w:t>
       </w:r>
       <w:proofErr w:type="gramEnd"/>
-    </w:p>
-    <w:p>
-      <w:pPr>
-        <w:rPr>
-          <w:lang w:val="en-CA"/>
-        </w:rPr>
-      </w:pPr>
-      <w:r>
-        <w:rPr>
-          <w:lang w:val="en-CA"/>
-        </w:rPr>
-        <w:t xml:space="preserve">brown - whether or not the species has brown on its </w:t>
+      <w:r>
+        <w:rPr>
+          <w:lang w:val="en-CA"/>
+        </w:rPr>
+        <w:t xml:space="preserve"> the species has white on its wing</w:t>
+      </w:r>
+    </w:p>
+    <w:p>
+      <w:pPr>
+        <w:rPr>
+          <w:lang w:val="en-CA"/>
+        </w:rPr>
+      </w:pPr>
+      <w:r>
+        <w:rPr>
+          <w:lang w:val="en-CA"/>
+        </w:rPr>
+        <w:t xml:space="preserve">brown - </w:t>
       </w:r>
       <w:proofErr w:type="gramStart"/>
       <w:r>
         <w:rPr>
           <w:lang w:val="en-CA"/>
         </w:rPr>
-        <w:t>wing</w:t>
+        <w:t>whether or not</w:t>
       </w:r>
       <w:proofErr w:type="gramEnd"/>
-    </w:p>
-    <w:p>
-      <w:pPr>
-        <w:rPr>
-          <w:lang w:val="en-CA"/>
-        </w:rPr>
-      </w:pPr>
-      <w:r>
-        <w:rPr>
-          <w:lang w:val="en-CA"/>
-        </w:rPr>
-        <w:t xml:space="preserve">red - whether or not the species has red on its </w:t>
+      <w:r>
+        <w:rPr>
+          <w:lang w:val="en-CA"/>
+        </w:rPr>
+        <w:t xml:space="preserve"> the species has brown on its wing</w:t>
+      </w:r>
+    </w:p>
+    <w:p>
+      <w:pPr>
+        <w:rPr>
+          <w:lang w:val="en-CA"/>
+        </w:rPr>
+      </w:pPr>
+      <w:r>
+        <w:rPr>
+          <w:lang w:val="en-CA"/>
+        </w:rPr>
+        <w:t xml:space="preserve">red - </w:t>
       </w:r>
       <w:proofErr w:type="gramStart"/>
       <w:r>
         <w:rPr>
           <w:lang w:val="en-CA"/>
         </w:rPr>
-        <w:t>wing</w:t>
+        <w:t>whether or not</w:t>
       </w:r>
       <w:proofErr w:type="gramEnd"/>
-    </w:p>
-    <w:p>
-      <w:pPr>
-        <w:rPr>
-          <w:lang w:val="en-CA"/>
-        </w:rPr>
-      </w:pPr>
-      <w:r>
-        <w:rPr>
-          <w:lang w:val="en-CA"/>
-        </w:rPr>
-        <w:t xml:space="preserve">orange - whether or not the species has orange on its </w:t>
+      <w:r>
+        <w:rPr>
+          <w:lang w:val="en-CA"/>
+        </w:rPr>
+        <w:t xml:space="preserve"> the species has red on its wing</w:t>
+      </w:r>
+    </w:p>
+    <w:p>
+      <w:pPr>
+        <w:rPr>
+          <w:lang w:val="en-CA"/>
+        </w:rPr>
+      </w:pPr>
+      <w:r>
+        <w:rPr>
+          <w:lang w:val="en-CA"/>
+        </w:rPr>
+        <w:t xml:space="preserve">orange - </w:t>
       </w:r>
       <w:proofErr w:type="gramStart"/>
       <w:r>
         <w:rPr>
           <w:lang w:val="en-CA"/>
         </w:rPr>
-        <w:t>wing</w:t>
+        <w:t>whether or not</w:t>
       </w:r>
       <w:proofErr w:type="gramEnd"/>
-    </w:p>
-    <w:p>
-      <w:pPr>
-        <w:rPr>
-          <w:lang w:val="en-CA"/>
-        </w:rPr>
-      </w:pPr>
-      <w:r>
-        <w:rPr>
-          <w:lang w:val="en-CA"/>
-        </w:rPr>
-        <w:t xml:space="preserve">yellow - whether or not the species has yellow on its </w:t>
+      <w:r>
+        <w:rPr>
+          <w:lang w:val="en-CA"/>
+        </w:rPr>
+        <w:t xml:space="preserve"> the species has orange on its wing</w:t>
+      </w:r>
+    </w:p>
+    <w:p>
+      <w:pPr>
+        <w:rPr>
+          <w:lang w:val="en-CA"/>
+        </w:rPr>
+      </w:pPr>
+      <w:r>
+        <w:rPr>
+          <w:lang w:val="en-CA"/>
+        </w:rPr>
+        <w:t xml:space="preserve">yellow - </w:t>
       </w:r>
       <w:proofErr w:type="gramStart"/>
       <w:r>
         <w:rPr>
           <w:lang w:val="en-CA"/>
         </w:rPr>
-        <w:t>wing</w:t>
+        <w:t>whether or not</w:t>
       </w:r>
       <w:proofErr w:type="gramEnd"/>
-    </w:p>
-    <w:p>
-      <w:pPr>
-        <w:rPr>
-          <w:lang w:val="en-CA"/>
-        </w:rPr>
-      </w:pPr>
-      <w:r>
-        <w:rPr>
-          <w:lang w:val="en-CA"/>
-        </w:rPr>
-        <w:t xml:space="preserve">green - whether or not the species has green on its </w:t>
+      <w:r>
+        <w:rPr>
+          <w:lang w:val="en-CA"/>
+        </w:rPr>
+        <w:t xml:space="preserve"> the species has yellow on its wing</w:t>
+      </w:r>
+    </w:p>
+    <w:p>
+      <w:pPr>
+        <w:rPr>
+          <w:lang w:val="en-CA"/>
+        </w:rPr>
+      </w:pPr>
+      <w:r>
+        <w:rPr>
+          <w:lang w:val="en-CA"/>
+        </w:rPr>
+        <w:t xml:space="preserve">green - </w:t>
       </w:r>
       <w:proofErr w:type="gramStart"/>
       <w:r>
         <w:rPr>
           <w:lang w:val="en-CA"/>
         </w:rPr>
-        <w:t>wing</w:t>
+        <w:t>whether or not</w:t>
       </w:r>
       <w:proofErr w:type="gramEnd"/>
-    </w:p>
-    <w:p>
-      <w:pPr>
-        <w:rPr>
-          <w:lang w:val="en-CA"/>
-        </w:rPr>
-      </w:pPr>
-      <w:r>
-        <w:rPr>
-          <w:lang w:val="en-CA"/>
-        </w:rPr>
-        <w:t xml:space="preserve">blue - whether or not the species has blue on its </w:t>
+      <w:r>
+        <w:rPr>
+          <w:lang w:val="en-CA"/>
+        </w:rPr>
+        <w:t xml:space="preserve"> the species has green on its wing</w:t>
+      </w:r>
+    </w:p>
+    <w:p>
+      <w:pPr>
+        <w:rPr>
+          <w:lang w:val="en-CA"/>
+        </w:rPr>
+      </w:pPr>
+      <w:r>
+        <w:rPr>
+          <w:lang w:val="en-CA"/>
+        </w:rPr>
+        <w:t xml:space="preserve">blue - </w:t>
       </w:r>
       <w:proofErr w:type="gramStart"/>
       <w:r>
         <w:rPr>
           <w:lang w:val="en-CA"/>
         </w:rPr>
-        <w:t>wing</w:t>
+        <w:t>whether or not</w:t>
       </w:r>
       <w:proofErr w:type="gramEnd"/>
-    </w:p>
-    <w:p>
-      <w:pPr>
-        <w:rPr>
-          <w:lang w:val="en-CA"/>
-        </w:rPr>
-      </w:pPr>
-      <w:r>
-        <w:rPr>
-          <w:lang w:val="en-CA"/>
-        </w:rPr>
-        <w:t xml:space="preserve">pink - whether or not the species has pink on its </w:t>
+      <w:r>
+        <w:rPr>
+          <w:lang w:val="en-CA"/>
+        </w:rPr>
+        <w:t xml:space="preserve"> the species has blue on its wing</w:t>
+      </w:r>
+    </w:p>
+    <w:p>
+      <w:pPr>
+        <w:rPr>
+          <w:lang w:val="en-CA"/>
+        </w:rPr>
+      </w:pPr>
+      <w:r>
+        <w:rPr>
+          <w:lang w:val="en-CA"/>
+        </w:rPr>
+        <w:t xml:space="preserve">pink - </w:t>
       </w:r>
       <w:proofErr w:type="gramStart"/>
       <w:r>
         <w:rPr>
           <w:lang w:val="en-CA"/>
         </w:rPr>
-        <w:t>wing</w:t>
+        <w:t>whether or not</w:t>
       </w:r>
       <w:proofErr w:type="gramEnd"/>
-    </w:p>
-    <w:p>
-      <w:pPr>
-        <w:rPr>
-          <w:lang w:val="en-CA"/>
-        </w:rPr>
-      </w:pPr>
-      <w:r>
-        <w:rPr>
-          <w:lang w:val="en-CA"/>
-        </w:rPr>
-        <w:t xml:space="preserve">purple - whether or not the species has purple on its </w:t>
+      <w:r>
+        <w:rPr>
+          <w:lang w:val="en-CA"/>
+        </w:rPr>
+        <w:t xml:space="preserve"> the species has pink on its wing</w:t>
+      </w:r>
+    </w:p>
+    <w:p>
+      <w:pPr>
+        <w:rPr>
+          <w:lang w:val="en-CA"/>
+        </w:rPr>
+      </w:pPr>
+      <w:r>
+        <w:rPr>
+          <w:lang w:val="en-CA"/>
+        </w:rPr>
+        <w:t xml:space="preserve">purple - </w:t>
       </w:r>
       <w:proofErr w:type="gramStart"/>
       <w:r>
         <w:rPr>
           <w:lang w:val="en-CA"/>
         </w:rPr>
-        <w:t>wing</w:t>
+        <w:t>whether or not</w:t>
       </w:r>
       <w:proofErr w:type="gramEnd"/>
-    </w:p>
-    <w:p>
-      <w:pPr>
-        <w:rPr>
-          <w:lang w:val="en-CA"/>
-        </w:rPr>
-      </w:pPr>
-      <w:r>
-        <w:rPr>
-          <w:lang w:val="en-CA"/>
-        </w:rPr>
-        <w:t xml:space="preserve">eyespot - whether or not the species has an eyespot feature on its </w:t>
+      <w:r>
+        <w:rPr>
+          <w:lang w:val="en-CA"/>
+        </w:rPr>
+        <w:t xml:space="preserve"> the species has purple on its wing</w:t>
+      </w:r>
+    </w:p>
+    <w:p>
+      <w:pPr>
+        <w:rPr>
+          <w:lang w:val="en-CA"/>
+        </w:rPr>
+      </w:pPr>
+      <w:r>
+        <w:rPr>
+          <w:lang w:val="en-CA"/>
+        </w:rPr>
+        <w:t xml:space="preserve">eyespot - </w:t>
       </w:r>
       <w:proofErr w:type="gramStart"/>
       <w:r>
         <w:rPr>
           <w:lang w:val="en-CA"/>
         </w:rPr>
-        <w:t>wing</w:t>
+        <w:t>whether or not</w:t>
       </w:r>
       <w:proofErr w:type="gramEnd"/>
-    </w:p>
-    <w:p>
-      <w:pPr>
-        <w:rPr>
-          <w:lang w:val="en-CA"/>
-        </w:rPr>
-      </w:pPr>
-      <w:r>
-        <w:rPr>
-          <w:lang w:val="en-CA"/>
-        </w:rPr>
-        <w:t xml:space="preserve">stripe - whether or not the species has a stripe feature on its </w:t>
+      <w:r>
+        <w:rPr>
+          <w:lang w:val="en-CA"/>
+        </w:rPr>
+        <w:t xml:space="preserve"> the species has an eyespot feature on its wing</w:t>
+      </w:r>
+    </w:p>
+    <w:p>
+      <w:pPr>
+        <w:rPr>
+          <w:lang w:val="en-CA"/>
+        </w:rPr>
+      </w:pPr>
+      <w:r>
+        <w:rPr>
+          <w:lang w:val="en-CA"/>
+        </w:rPr>
+        <w:lastRenderedPageBreak/>
+        <w:t xml:space="preserve">stripe - </w:t>
       </w:r>
       <w:proofErr w:type="gramStart"/>
       <w:r>
         <w:rPr>
           <w:lang w:val="en-CA"/>
         </w:rPr>
-        <w:t>wing</w:t>
+        <w:t>whether or not</w:t>
       </w:r>
       <w:proofErr w:type="gramEnd"/>
-    </w:p>
-    <w:p>
-      <w:pPr>
-        <w:rPr>
-          <w:lang w:val="en-CA"/>
-        </w:rPr>
-      </w:pPr>
-      <w:r>
-        <w:rPr>
-          <w:lang w:val="en-CA"/>
-        </w:rPr>
-        <w:t xml:space="preserve">checker - whether or not the species has a checker feature on its </w:t>
+      <w:r>
+        <w:rPr>
+          <w:lang w:val="en-CA"/>
+        </w:rPr>
+        <w:t xml:space="preserve"> the species has a stripe feature on its wing</w:t>
+      </w:r>
+    </w:p>
+    <w:p>
+      <w:pPr>
+        <w:rPr>
+          <w:lang w:val="en-CA"/>
+        </w:rPr>
+      </w:pPr>
+      <w:r>
+        <w:rPr>
+          <w:lang w:val="en-CA"/>
+        </w:rPr>
+        <w:t xml:space="preserve">checker - </w:t>
       </w:r>
       <w:proofErr w:type="gramStart"/>
       <w:r>
         <w:rPr>
           <w:lang w:val="en-CA"/>
         </w:rPr>
-        <w:t>wing</w:t>
+        <w:t>whether or not</w:t>
       </w:r>
       <w:proofErr w:type="gramEnd"/>
-    </w:p>
-    <w:p>
-      <w:pPr>
-        <w:rPr>
-          <w:lang w:val="en-CA"/>
-        </w:rPr>
-      </w:pPr>
-      <w:r>
-        <w:rPr>
-          <w:lang w:val="en-CA"/>
-        </w:rPr>
-        <w:t xml:space="preserve">tail - whether or not the species has a wing </w:t>
+      <w:r>
+        <w:rPr>
+          <w:lang w:val="en-CA"/>
+        </w:rPr>
+        <w:t xml:space="preserve"> the species has a checker feature on its wing</w:t>
+      </w:r>
+    </w:p>
+    <w:p>
+      <w:pPr>
+        <w:rPr>
+          <w:lang w:val="en-CA"/>
+        </w:rPr>
+      </w:pPr>
+      <w:r>
+        <w:rPr>
+          <w:lang w:val="en-CA"/>
+        </w:rPr>
+        <w:t xml:space="preserve">tail - </w:t>
       </w:r>
       <w:proofErr w:type="gramStart"/>
       <w:r>
         <w:rPr>
           <w:lang w:val="en-CA"/>
         </w:rPr>
-        <w:t>tail</w:t>
+        <w:t>whether or not</w:t>
       </w:r>
       <w:proofErr w:type="gramEnd"/>
-    </w:p>
-    <w:p>
-      <w:pPr>
-        <w:rPr>
-          <w:lang w:val="en-CA"/>
-        </w:rPr>
-      </w:pPr>
-      <w:r>
-        <w:rPr>
-          <w:lang w:val="en-CA"/>
-        </w:rPr>
-        <w:t xml:space="preserve">band - whether or not the species has a banding feature on its </w:t>
+      <w:r>
+        <w:rPr>
+          <w:lang w:val="en-CA"/>
+        </w:rPr>
+        <w:t xml:space="preserve"> the species has a wing tail</w:t>
+      </w:r>
+    </w:p>
+    <w:p>
+      <w:pPr>
+        <w:rPr>
+          <w:lang w:val="en-CA"/>
+        </w:rPr>
+      </w:pPr>
+      <w:r>
+        <w:rPr>
+          <w:lang w:val="en-CA"/>
+        </w:rPr>
+        <w:t xml:space="preserve">band - </w:t>
       </w:r>
       <w:proofErr w:type="gramStart"/>
       <w:r>
         <w:rPr>
           <w:lang w:val="en-CA"/>
         </w:rPr>
-        <w:t>wing</w:t>
+        <w:t>whether or not</w:t>
       </w:r>
       <w:proofErr w:type="gramEnd"/>
-    </w:p>
-    <w:p>
-      <w:pPr>
-        <w:rPr>
-          <w:lang w:val="en-CA"/>
-        </w:rPr>
-      </w:pPr>
-      <w:r>
-        <w:rPr>
-          <w:lang w:val="en-CA"/>
-        </w:rPr>
-        <w:t xml:space="preserve">spot - whether or not the species has a spot feature on its </w:t>
+      <w:r>
+        <w:rPr>
+          <w:lang w:val="en-CA"/>
+        </w:rPr>
+        <w:t xml:space="preserve"> the species has a banding feature on its wing</w:t>
+      </w:r>
+    </w:p>
+    <w:p>
+      <w:pPr>
+        <w:rPr>
+          <w:lang w:val="en-CA"/>
+        </w:rPr>
+      </w:pPr>
+      <w:r>
+        <w:rPr>
+          <w:lang w:val="en-CA"/>
+        </w:rPr>
+        <w:t xml:space="preserve">spot - </w:t>
       </w:r>
       <w:proofErr w:type="gramStart"/>
       <w:r>
         <w:rPr>
           <w:lang w:val="en-CA"/>
         </w:rPr>
-        <w:t>wing</w:t>
+        <w:t>whether or not</w:t>
       </w:r>
       <w:proofErr w:type="gramEnd"/>
+      <w:r>
+        <w:rPr>
+          <w:lang w:val="en-CA"/>
+        </w:rPr>
+        <w:t xml:space="preserve"> the species has a spot feature on its wing</w:t>
+      </w:r>
     </w:p>
     <w:p>
       <w:pPr>
@@ -1163,55 +2132,13 @@
         <w:rPr>
           <w:lang w:val="en-CA"/>
         </w:rPr>
-        <w:t xml:space="preserve">These data contain information on the proportion of records in </w:t>
-      </w:r>
-      <w:proofErr w:type="spellStart"/>
-      <w:r>
-        <w:rPr>
-          <w:lang w:val="en-CA"/>
-        </w:rPr>
-        <w:t>iNaturalist</w:t>
-      </w:r>
-      <w:proofErr w:type="spellEnd"/>
-      <w:r>
-        <w:rPr>
-          <w:lang w:val="en-CA"/>
-        </w:rPr>
-        <w:t xml:space="preserve"> for each genus that are identified to species level with research grade designation. Goldstein et al., 2024, found that species in genera with a higher proportion of research grade observations (i.e., species that are easier to detect) tended to have higher detection odds. As such, we aimed to control for this as a potential predictor of species-specific detection rate in our occupancy models. We gathered these data for all genera included in our study</w:t>
-      </w:r>
-      <w:r>
-        <w:rPr>
-          <w:lang w:val="en-CA"/>
-        </w:rPr>
-        <w:t xml:space="preserve"> by determining the total number and number of research grade </w:t>
-      </w:r>
-      <w:proofErr w:type="spellStart"/>
-      <w:r>
-        <w:rPr>
-          <w:lang w:val="en-CA"/>
-        </w:rPr>
-        <w:t>iNaturalist</w:t>
-      </w:r>
-      <w:proofErr w:type="spellEnd"/>
-      <w:r>
-        <w:rPr>
-          <w:lang w:val="en-CA"/>
-        </w:rPr>
-        <w:t xml:space="preserve"> observations within the United States, using the </w:t>
-      </w:r>
-      <w:proofErr w:type="spellStart"/>
-      <w:r>
-        <w:rPr>
-          <w:lang w:val="en-CA"/>
-        </w:rPr>
-        <w:t>iNaturalist</w:t>
-      </w:r>
-      <w:proofErr w:type="spellEnd"/>
-      <w:r>
-        <w:rPr>
-          <w:lang w:val="en-CA"/>
-        </w:rPr>
-        <w:t xml:space="preserve"> website’s observation search and filter functions. This file </w:t>
+        <w:t>These data contain information on the proportion of records in iNaturalist for each genus that are identified to species level with research grade designation. Goldstein et al., 2024, found that species in genera with a higher proportion of research grade observations (i.e., species that are easier to detect) tended to have higher detection odds. As such, we aimed to control for this as a potential predictor of species-specific detection rate in our occupancy models. We gathered these data for all genera included in our study</w:t>
+      </w:r>
+      <w:r>
+        <w:rPr>
+          <w:lang w:val="en-CA"/>
+        </w:rPr>
+        <w:t xml:space="preserve"> by determining the total number and number of research grade iNaturalist observations within the United States, using the iNaturalist website’s observation search and filter functions. This file </w:t>
       </w:r>
       <w:r>
         <w:rPr>
@@ -1236,7 +2163,6 @@
         <w:rPr>
           <w:lang w:val="en-CA"/>
         </w:rPr>
-        <w:lastRenderedPageBreak/>
         <w:t>genus</w:t>
       </w:r>
       <w:r>
@@ -1393,48 +2319,40 @@
         <w:rPr>
           <w:lang w:val="en-CA"/>
         </w:rPr>
-        <w:t>total_</w:t>
-      </w:r>
+        <w:t>total_detections</w:t>
+      </w:r>
+      <w:proofErr w:type="spellEnd"/>
+    </w:p>
+    <w:p>
+      <w:pPr>
+        <w:rPr>
+          <w:lang w:val="en-CA"/>
+        </w:rPr>
+      </w:pPr>
+      <w:proofErr w:type="spellStart"/>
+      <w:r>
+        <w:rPr>
+          <w:lang w:val="en-CA"/>
+        </w:rPr>
+        <w:t>date_data_obtained</w:t>
+      </w:r>
+      <w:proofErr w:type="spellEnd"/>
+      <w:r>
+        <w:rPr>
+          <w:lang w:val="en-CA"/>
+        </w:rPr>
+        <w:t xml:space="preserve"> - date (</w:t>
+      </w:r>
+      <w:proofErr w:type="spellStart"/>
       <w:proofErr w:type="gramStart"/>
       <w:r>
         <w:rPr>
           <w:lang w:val="en-CA"/>
         </w:rPr>
-        <w:t>detections</w:t>
+        <w:t>month.day.year</w:t>
       </w:r>
       <w:proofErr w:type="spellEnd"/>
       <w:proofErr w:type="gramEnd"/>
-    </w:p>
-    <w:p>
-      <w:pPr>
-        <w:rPr>
-          <w:lang w:val="en-CA"/>
-        </w:rPr>
-      </w:pPr>
-      <w:proofErr w:type="spellStart"/>
-      <w:r>
-        <w:rPr>
-          <w:lang w:val="en-CA"/>
-        </w:rPr>
-        <w:t>date_data_obtained</w:t>
-      </w:r>
-      <w:proofErr w:type="spellEnd"/>
-      <w:r>
-        <w:rPr>
-          <w:lang w:val="en-CA"/>
-        </w:rPr>
-        <w:t xml:space="preserve"> - date (</w:t>
-      </w:r>
-      <w:proofErr w:type="spellStart"/>
-      <w:proofErr w:type="gramStart"/>
-      <w:r>
-        <w:rPr>
-          <w:lang w:val="en-CA"/>
-        </w:rPr>
-        <w:t>month.day.year</w:t>
-      </w:r>
-      <w:proofErr w:type="spellEnd"/>
-      <w:proofErr w:type="gramEnd"/>
       <w:r>
         <w:rPr>
           <w:lang w:val="en-CA"/>
@@ -1605,7 +2523,7 @@
           <w:lang w:val="en-CA"/>
         </w:rPr>
       </w:pPr>
-      <w:hyperlink r:id="rId7" w:history="1">
+      <w:hyperlink r:id="rId8" w:history="1">
         <w:r>
           <w:rPr>
             <w:rStyle w:val="Hyperlink"/>
@@ -1625,21 +2543,14 @@
         <w:rPr>
           <w:lang w:val="en-CA"/>
         </w:rPr>
-        <w:t xml:space="preserve">Shirey, V., Larsen, E., Doherty, A., Kim, C.A., Al-Sulaiman, F.T., </w:t>
-      </w:r>
-      <w:proofErr w:type="spellStart"/>
-      <w:r>
-        <w:rPr>
-          <w:lang w:val="en-CA"/>
-        </w:rPr>
-        <w:t>Hinolan</w:t>
-      </w:r>
-      <w:proofErr w:type="spellEnd"/>
-      <w:r>
-        <w:rPr>
-          <w:lang w:val="en-CA"/>
-        </w:rPr>
-        <w:t>, J.D., Itliong, M.G.A., Naive, M.A.K., Ku, M., Belitz, M., Jeschke, G., Barve, V., Lamas, G., Kawahara, A.Y., Guralnick, R., Pierce, N.E., Lohman, D.J., and Ries, L. 2022. "</w:t>
+        <w:t xml:space="preserve">Shirey, V., Larsen, E., Doherty, A., Kim, C.A., Al-Sulaiman, F.T., Hinolan, J.D., Itliong, M.G.A., Naive, M.A.K., Ku, M., Belitz, M., Jeschke, G., Barve, V., Lamas, G., Kawahara, A.Y., Guralnick, R., Pierce, </w:t>
+      </w:r>
+      <w:r>
+        <w:rPr>
+          <w:lang w:val="en-CA"/>
+        </w:rPr>
+        <w:lastRenderedPageBreak/>
+        <w:t>N.E., Lohman, D.J., and Ries, L. 2022. "</w:t>
       </w:r>
       <w:proofErr w:type="spellStart"/>
       <w:r>
@@ -1681,7 +2592,7 @@
 </file>
 
 <file path=word/styles.xml><?xml version="1.0" encoding="utf-8"?>
-<w:styles xmlns:mc="http://schemas.openxmlformats.org/markup-compatibility/2006" xmlns:r="http://schemas.openxmlformats.org/officeDocument/2006/relationships" xmlns:w="http://schemas.openxmlformats.org/wordprocessingml/2006/main" xmlns:w14="http://schemas.microsoft.com/office/word/2010/wordml" xmlns:w15="http://schemas.microsoft.com/office/word/2012/wordml" xmlns:w16cex="http://schemas.microsoft.com/office/word/2018/wordml/cex" xmlns:w16cid="http://schemas.microsoft.com/office/word/2016/wordml/cid" xmlns:w16="http://schemas.microsoft.com/office/word/2018/wordml" xmlns:w16du="http://schemas.microsoft.com/office/word/2023/wordml/word16du" xmlns:w16sdtdh="http://schemas.microsoft.com/office/word/2020/wordml/sdtdatahash" xmlns:w16se="http://schemas.microsoft.com/office/word/2015/wordml/symex" mc:Ignorable="w14 w15 w16se w16cid w16 w16cex w16sdtdh w16du">
+<w:styles xmlns:mc="http://schemas.openxmlformats.org/markup-compatibility/2006" xmlns:r="http://schemas.openxmlformats.org/officeDocument/2006/relationships" xmlns:w="http://schemas.openxmlformats.org/wordprocessingml/2006/main" xmlns:w14="http://schemas.microsoft.com/office/word/2010/wordml" xmlns:w15="http://schemas.microsoft.com/office/word/2012/wordml" xmlns:w16cex="http://schemas.microsoft.com/office/word/2018/wordml/cex" xmlns:w16cid="http://schemas.microsoft.com/office/word/2016/wordml/cid" xmlns:w16="http://schemas.microsoft.com/office/word/2018/wordml" xmlns:w16du="http://schemas.microsoft.com/office/word/2023/wordml/word16du" xmlns:w16sdtdh="http://schemas.microsoft.com/office/word/2020/wordml/sdtdatahash" xmlns:w16sdtfl="http://schemas.microsoft.com/office/word/2024/wordml/sdtformatlock" xmlns:w16se="http://schemas.microsoft.com/office/word/2015/wordml/symex" mc:Ignorable="w14 w15 w16se w16cid w16 w16cex w16sdtdh w16sdtfl w16du">
   <w:docDefaults>
     <w:rPrDefault>
       <w:rPr>

</xml_diff>

<commit_message>
add derived city wide predictors table and update readme
</commit_message>
<xml_diff>
--- a/data/metadata.docx
+++ b/data/metadata.docx
@@ -3,11 +3,6 @@
 <w:document xmlns:wpc="http://schemas.microsoft.com/office/word/2010/wordprocessingCanvas" xmlns:cx="http://schemas.microsoft.com/office/drawing/2014/chartex" xmlns:cx1="http://schemas.microsoft.com/office/drawing/2015/9/8/chartex" xmlns:cx2="http://schemas.microsoft.com/office/drawing/2015/10/21/chartex" xmlns:cx3="http://schemas.microsoft.com/office/drawing/2016/5/9/chartex" xmlns:cx4="http://schemas.microsoft.com/office/drawing/2016/5/10/chartex" xmlns:cx5="http://schemas.microsoft.com/office/drawing/2016/5/11/chartex" xmlns:cx6="http://schemas.microsoft.com/office/drawing/2016/5/12/chartex" xmlns:cx7="http://schemas.microsoft.com/office/drawing/2016/5/13/chartex" xmlns:cx8="http://schemas.microsoft.com/office/drawing/2016/5/14/chartex" xmlns:mc="http://schemas.openxmlformats.org/markup-compatibility/2006" xmlns:aink="http://schemas.microsoft.com/office/drawing/2016/ink" xmlns:am3d="http://schemas.microsoft.com/office/drawing/2017/model3d" xmlns:o="urn:schemas-microsoft-com:office:office" xmlns:oel="http://schemas.microsoft.com/office/2019/extlst" xmlns:r="http://schemas.openxmlformats.org/officeDocument/2006/relationships" xmlns:m="http://schemas.openxmlformats.org/officeDocument/2006/math" xmlns:v="urn:schemas-microsoft-com:vml" xmlns:wp14="http://schemas.microsoft.com/office/word/2010/wordprocessingDrawing" xmlns:wp="http://schemas.openxmlformats.org/drawingml/2006/wordprocessingDrawing" xmlns:w10="urn:schemas-microsoft-com:office:word" xmlns:w="http://schemas.openxmlformats.org/wordprocessingml/2006/main" xmlns:w14="http://schemas.microsoft.com/office/word/2010/wordml" xmlns:w15="http://schemas.microsoft.com/office/word/2012/wordml" xmlns:w16cex="http://schemas.microsoft.com/office/word/2018/wordml/cex" xmlns:w16cid="http://schemas.microsoft.com/office/word/2016/wordml/cid" xmlns:w16="http://schemas.microsoft.com/office/word/2018/wordml" xmlns:w16du="http://schemas.microsoft.com/office/word/2023/wordml/word16du" xmlns:w16sdtdh="http://schemas.microsoft.com/office/word/2020/wordml/sdtdatahash" xmlns:w16sdtfl="http://schemas.microsoft.com/office/word/2024/wordml/sdtformatlock" xmlns:w16se="http://schemas.microsoft.com/office/word/2015/wordml/symex" xmlns:wpg="http://schemas.microsoft.com/office/word/2010/wordprocessingGroup" xmlns:wpi="http://schemas.microsoft.com/office/word/2010/wordprocessingInk" xmlns:wne="http://schemas.microsoft.com/office/word/2006/wordml" xmlns:wps="http://schemas.microsoft.com/office/word/2010/wordprocessingShape" mc:Ignorable="w14 w15 w16se w16cid w16 w16cex w16sdtdh w16sdtfl w16du wp14">
   <w:body>
     <w:p>
-      <w:pPr>
-        <w:rPr>
-          <w:lang w:val="en-CA"/>
-        </w:rPr>
-      </w:pPr>
       <w:r>
         <w:rPr>
           <w:lang w:val="en-CA"/>
@@ -21,10 +16,7 @@
         <w:t>“</w:t>
       </w:r>
       <w:r>
-        <w:rPr>
-          <w:lang w:val="en-CA"/>
-        </w:rPr>
-        <w:t>Community science synthesis reveals consistent positive effects of park size and tree cover on butterfly diversity across 22 major US cities</w:t>
+        <w:t>Large parks and city-wide tree cover boost butterfly diversity across 22 major U.S. cities</w:t>
       </w:r>
       <w:r>
         <w:rPr>
@@ -69,21 +61,7 @@
         <w:rPr>
           <w:lang w:val="en-CA"/>
         </w:rPr>
-        <w:t xml:space="preserve">Within the </w:t>
-      </w:r>
-      <w:proofErr w:type="spellStart"/>
-      <w:r>
-        <w:rPr>
-          <w:lang w:val="en-CA"/>
-        </w:rPr>
-        <w:t>github</w:t>
-      </w:r>
-      <w:proofErr w:type="spellEnd"/>
-      <w:r>
-        <w:rPr>
-          <w:lang w:val="en-CA"/>
-        </w:rPr>
-        <w:t xml:space="preserve"> directory, data are contained within the </w:t>
+        <w:t xml:space="preserve">Within the github directory, data are contained within the </w:t>
       </w:r>
       <w:proofErr w:type="gramStart"/>
       <w:r>
@@ -141,25 +119,7 @@
           <w:bCs/>
           <w:lang w:val="en-CA"/>
         </w:rPr>
-        <w:t>/data/</w:t>
-      </w:r>
-      <w:proofErr w:type="spellStart"/>
-      <w:r>
-        <w:rPr>
-          <w:b/>
-          <w:bCs/>
-          <w:lang w:val="en-CA"/>
-        </w:rPr>
-        <w:t>buffer_around_parks</w:t>
-      </w:r>
-      <w:proofErr w:type="spellEnd"/>
-      <w:r>
-        <w:rPr>
-          <w:b/>
-          <w:bCs/>
-          <w:lang w:val="en-CA"/>
-        </w:rPr>
-        <w:t>/2km_park_buffer/</w:t>
+        <w:t>/data/buffer_around_parks/2km_park_buffer/</w:t>
       </w:r>
     </w:p>
     <w:p>
@@ -181,20 +141,12 @@
         </w:rPr>
         <w:t>“./</w:t>
       </w:r>
-      <w:proofErr w:type="spellStart"/>
       <w:proofErr w:type="gramEnd"/>
       <w:r>
         <w:rPr>
           <w:lang w:val="en-CA"/>
         </w:rPr>
-        <w:t>data_wrangling</w:t>
-      </w:r>
-      <w:proofErr w:type="spellEnd"/>
-      <w:r>
-        <w:rPr>
-          <w:lang w:val="en-CA"/>
-        </w:rPr>
-        <w:t>/</w:t>
+        <w:t>data_wrangling/</w:t>
       </w:r>
       <w:r>
         <w:rPr>
@@ -223,19 +175,11 @@
           <w:lang w:val="en-CA"/>
         </w:rPr>
       </w:pPr>
-      <w:proofErr w:type="spellStart"/>
-      <w:r>
-        <w:rPr>
-          <w:lang w:val="en-CA"/>
-        </w:rPr>
-        <w:t>ParkID</w:t>
-      </w:r>
-      <w:proofErr w:type="spellEnd"/>
-      <w:r>
-        <w:rPr>
-          <w:lang w:val="en-CA"/>
-        </w:rPr>
-        <w:t xml:space="preserve"> – </w:t>
+      <w:r>
+        <w:rPr>
+          <w:lang w:val="en-CA"/>
+        </w:rPr>
+        <w:t xml:space="preserve">ParkID – </w:t>
       </w:r>
       <w:proofErr w:type="gramStart"/>
       <w:r>
@@ -249,90 +193,46 @@
         <w:rPr>
           <w:lang w:val="en-CA"/>
         </w:rPr>
-        <w:t xml:space="preserve"> identifier assigned by the original park shapefile provided by </w:t>
-      </w:r>
-      <w:proofErr w:type="spellStart"/>
-      <w:r>
-        <w:rPr>
-          <w:lang w:val="en-CA"/>
-        </w:rPr>
-        <w:t>ParkServe</w:t>
-      </w:r>
-      <w:proofErr w:type="spellEnd"/>
-      <w:r>
-        <w:rPr>
-          <w:lang w:val="en-CA"/>
-        </w:rPr>
-        <w:t xml:space="preserve">. </w:t>
-      </w:r>
-    </w:p>
-    <w:p>
-      <w:pPr>
-        <w:rPr>
-          <w:lang w:val="en-CA"/>
-        </w:rPr>
-      </w:pPr>
-      <w:proofErr w:type="spellStart"/>
-      <w:r>
-        <w:rPr>
-          <w:lang w:val="en-CA"/>
-        </w:rPr>
-        <w:t>New_id</w:t>
-      </w:r>
-      <w:proofErr w:type="spellEnd"/>
-      <w:r>
-        <w:rPr>
-          <w:lang w:val="en-CA"/>
-        </w:rPr>
-        <w:t xml:space="preserve"> – Unique (within-city) integer park identifier.</w:t>
-      </w:r>
-    </w:p>
-    <w:p>
-      <w:pPr>
-        <w:rPr>
-          <w:lang w:val="en-CA"/>
-        </w:rPr>
-      </w:pPr>
-      <w:proofErr w:type="spellStart"/>
-      <w:r>
-        <w:rPr>
-          <w:lang w:val="en-CA"/>
-        </w:rPr>
-        <w:t>ParkCount</w:t>
-      </w:r>
-      <w:proofErr w:type="spellEnd"/>
-      <w:r>
-        <w:rPr>
-          <w:lang w:val="en-CA"/>
-        </w:rPr>
-        <w:t xml:space="preserve"> – the number of smaller shapefiles that were merged into a single park polygon.</w:t>
-      </w:r>
-    </w:p>
-    <w:p>
-      <w:pPr>
-        <w:rPr>
-          <w:lang w:val="en-CA"/>
-        </w:rPr>
-      </w:pPr>
-      <w:r>
-        <w:rPr>
-          <w:lang w:val="en-CA"/>
-        </w:rPr>
-        <w:t xml:space="preserve">Type – “Classified” indicates that the park has some area within the administrative boundary of the city, as defined by the </w:t>
-      </w:r>
-      <w:proofErr w:type="spellStart"/>
-      <w:r>
-        <w:rPr>
-          <w:lang w:val="en-CA"/>
-        </w:rPr>
-        <w:t>UrbanWatch</w:t>
-      </w:r>
-      <w:proofErr w:type="spellEnd"/>
-      <w:r>
-        <w:rPr>
-          <w:lang w:val="en-CA"/>
-        </w:rPr>
-        <w:t xml:space="preserve"> dataset.</w:t>
+        <w:t xml:space="preserve"> identifier assigned by the original park shapefile provided by ParkServe. </w:t>
+      </w:r>
+    </w:p>
+    <w:p>
+      <w:pPr>
+        <w:rPr>
+          <w:lang w:val="en-CA"/>
+        </w:rPr>
+      </w:pPr>
+      <w:r>
+        <w:rPr>
+          <w:lang w:val="en-CA"/>
+        </w:rPr>
+        <w:t>New_id – Unique (within-city) integer park identifier.</w:t>
+      </w:r>
+    </w:p>
+    <w:p>
+      <w:pPr>
+        <w:rPr>
+          <w:lang w:val="en-CA"/>
+        </w:rPr>
+      </w:pPr>
+      <w:r>
+        <w:rPr>
+          <w:lang w:val="en-CA"/>
+        </w:rPr>
+        <w:t>ParkCount – the number of smaller shapefiles that were merged into a single park polygon.</w:t>
+      </w:r>
+    </w:p>
+    <w:p>
+      <w:pPr>
+        <w:rPr>
+          <w:lang w:val="en-CA"/>
+        </w:rPr>
+      </w:pPr>
+      <w:r>
+        <w:rPr>
+          <w:lang w:val="en-CA"/>
+        </w:rPr>
+        <w:t>Type – “Classified” indicates that the park has some area within the administrative boundary of the city, as defined by the UrbanWatch dataset.</w:t>
       </w:r>
     </w:p>
     <w:p>
@@ -344,7 +244,6 @@
           <w14:ligatures w14:val="none"/>
         </w:rPr>
       </w:pPr>
-      <w:proofErr w:type="spellStart"/>
       <w:r>
         <w:rPr>
           <w:rFonts w:eastAsia="Times New Roman" w:cs="Times New Roman"/>
@@ -352,17 +251,7 @@
           <w:kern w:val="0"/>
           <w14:ligatures w14:val="none"/>
         </w:rPr>
-        <w:t>total_sur_area_sqm</w:t>
-      </w:r>
-      <w:proofErr w:type="spellEnd"/>
-      <w:r>
-        <w:rPr>
-          <w:rFonts w:eastAsia="Times New Roman" w:cs="Times New Roman"/>
-          <w:color w:val="000000"/>
-          <w:kern w:val="0"/>
-          <w14:ligatures w14:val="none"/>
-        </w:rPr>
-        <w:t xml:space="preserve"> – total surface area of the park polygon in meters squared.</w:t>
+        <w:t>total_sur_area_sqm – total surface area of the park polygon in meters squared.</w:t>
       </w:r>
     </w:p>
     <w:p>
@@ -437,7 +326,6 @@
           <w14:ligatures w14:val="none"/>
         </w:rPr>
       </w:pPr>
-      <w:proofErr w:type="spellStart"/>
       <w:r>
         <w:rPr>
           <w:rFonts w:eastAsia="Times New Roman" w:cs="Times New Roman"/>
@@ -445,17 +333,7 @@
           <w:kern w:val="0"/>
           <w14:ligatures w14:val="none"/>
         </w:rPr>
-        <w:t>Landcover_type_diversity</w:t>
-      </w:r>
-      <w:proofErr w:type="spellEnd"/>
-      <w:r>
-        <w:rPr>
-          <w:rFonts w:eastAsia="Times New Roman" w:cs="Times New Roman"/>
-          <w:color w:val="000000"/>
-          <w:kern w:val="0"/>
-          <w14:ligatures w14:val="none"/>
-        </w:rPr>
-        <w:t xml:space="preserve"> – the number of land cover classes present in the park buffer area (i.e., number of class columns with an area &gt; 0).</w:t>
+        <w:t>Landcover_type_diversity – the number of land cover classes present in the park buffer area (i.e., number of class columns with an area &gt; 0).</w:t>
       </w:r>
     </w:p>
     <w:p>
@@ -506,18 +384,8 @@
           <w:bCs/>
           <w:lang w:val="en-CA"/>
         </w:rPr>
-        <w:t>/data/</w:t>
-      </w:r>
-      <w:proofErr w:type="spellStart"/>
-      <w:r>
-        <w:rPr>
-          <w:b/>
-          <w:bCs/>
-          <w:lang w:val="en-CA"/>
-        </w:rPr>
-        <w:t>city_shapefiles</w:t>
-      </w:r>
-      <w:proofErr w:type="spellEnd"/>
+        <w:t>/data/city_shapefiles</w:t>
+      </w:r>
       <w:r>
         <w:rPr>
           <w:b/>
@@ -537,35 +405,7 @@
         <w:rPr>
           <w:lang w:val="en-CA"/>
         </w:rPr>
-        <w:t>Within this folder “</w:t>
-      </w:r>
-      <w:proofErr w:type="spellStart"/>
-      <w:r>
-        <w:rPr>
-          <w:lang w:val="en-CA"/>
-        </w:rPr>
-        <w:t>park_classification_cityname.rds</w:t>
-      </w:r>
-      <w:proofErr w:type="spellEnd"/>
-      <w:r>
-        <w:rPr>
-          <w:lang w:val="en-CA"/>
-        </w:rPr>
-        <w:t xml:space="preserve">” files contain an R readable shapefile with city parks. “Classified” parks are the parks that overlap with the city administrative boundary defined by </w:t>
-      </w:r>
-      <w:proofErr w:type="spellStart"/>
-      <w:r>
-        <w:rPr>
-          <w:lang w:val="en-CA"/>
-        </w:rPr>
-        <w:t>UrbanWatch</w:t>
-      </w:r>
-      <w:proofErr w:type="spellEnd"/>
-      <w:r>
-        <w:rPr>
-          <w:lang w:val="en-CA"/>
-        </w:rPr>
-        <w:t>. I don’t think we need the actual shapefiles in this folder that are there for a couple of cities?</w:t>
+        <w:t>Within this folder “park_classification_cityname.rds” files contain an R readable shapefile with city parks. “Classified” parks are the parks that overlap with the city administrative boundary defined by UrbanWatch. I don’t think we need the actual shapefiles in this folder that are there for a couple of cities?</w:t>
       </w:r>
     </w:p>
     <w:p>
@@ -609,33 +449,15 @@
           <w:bCs/>
           <w:lang w:val="en-CA"/>
         </w:rPr>
-        <w:t>/data/</w:t>
-      </w:r>
-      <w:proofErr w:type="spellStart"/>
-      <w:r>
-        <w:rPr>
-          <w:b/>
-          <w:bCs/>
-          <w:lang w:val="en-CA"/>
-        </w:rPr>
-        <w:t>city_</w:t>
-      </w:r>
-      <w:r>
-        <w:rPr>
-          <w:b/>
-          <w:bCs/>
-          <w:lang w:val="en-CA"/>
-        </w:rPr>
-        <w:t>wide_data</w:t>
-      </w:r>
-      <w:proofErr w:type="spellEnd"/>
-      <w:r>
-        <w:rPr>
-          <w:b/>
-          <w:bCs/>
-          <w:lang w:val="en-CA"/>
-        </w:rPr>
-        <w:t>/</w:t>
+        <w:t>/data/city_</w:t>
+      </w:r>
+      <w:r>
+        <w:rPr>
+          <w:b/>
+          <w:bCs/>
+          <w:lang w:val="en-CA"/>
+        </w:rPr>
+        <w:t>wide_data/</w:t>
       </w:r>
     </w:p>
     <w:p>
@@ -686,35 +508,7 @@
         <w:rPr>
           <w:lang w:val="en-CA"/>
         </w:rPr>
-        <w:t xml:space="preserve"> – columns contain the area (meters sq) of each of the 8 land cover categories described by </w:t>
-      </w:r>
-      <w:proofErr w:type="spellStart"/>
-      <w:r>
-        <w:rPr>
-          <w:lang w:val="en-CA"/>
-        </w:rPr>
-        <w:t>UrbanWatch</w:t>
-      </w:r>
-      <w:proofErr w:type="spellEnd"/>
-      <w:r>
-        <w:rPr>
-          <w:lang w:val="en-CA"/>
-        </w:rPr>
-        <w:t xml:space="preserve">, as well as the total area of the city (meters sq) as defined by </w:t>
-      </w:r>
-      <w:proofErr w:type="spellStart"/>
-      <w:r>
-        <w:rPr>
-          <w:lang w:val="en-CA"/>
-        </w:rPr>
-        <w:t>UrbanWatch</w:t>
-      </w:r>
-      <w:proofErr w:type="spellEnd"/>
-      <w:r>
-        <w:rPr>
-          <w:lang w:val="en-CA"/>
-        </w:rPr>
-        <w:t>.</w:t>
+        <w:t xml:space="preserve"> – columns contain the area (meters sq) of each of the 8 land cover categories described by UrbanWatch, as well as the total area of the city (meters sq) as defined by UrbanWatch.</w:t>
       </w:r>
     </w:p>
     <w:p>
@@ -735,20 +529,12 @@
         </w:rPr>
         <w:t xml:space="preserve">.csv – columns contain the IIC metric (Integral Index of Connectivity) for the set of parks contained within each city. IIC was calculated using the </w:t>
       </w:r>
-      <w:proofErr w:type="spellStart"/>
       <w:proofErr w:type="gramStart"/>
       <w:r>
         <w:rPr>
           <w:lang w:val="en-CA"/>
         </w:rPr>
-        <w:t>lconnect</w:t>
-      </w:r>
-      <w:proofErr w:type="spellEnd"/>
-      <w:r>
-        <w:rPr>
-          <w:lang w:val="en-CA"/>
-        </w:rPr>
-        <w:t>(</w:t>
+        <w:t>lconnect(</w:t>
       </w:r>
       <w:proofErr w:type="gramEnd"/>
       <w:r>
@@ -775,32 +561,14 @@
         <w:rPr>
           <w:lang w:val="en-CA"/>
         </w:rPr>
-        <w:t xml:space="preserve">.csv  </w:t>
-      </w:r>
-      <w:r>
-        <w:rPr>
-          <w:lang w:val="en-CA"/>
-        </w:rPr>
-        <w:t>–</w:t>
+        <w:t>.csv  –</w:t>
       </w:r>
       <w:proofErr w:type="gramEnd"/>
       <w:r>
         <w:rPr>
           <w:lang w:val="en-CA"/>
         </w:rPr>
-        <w:t xml:space="preserve"> </w:t>
-      </w:r>
-      <w:r>
-        <w:rPr>
-          <w:lang w:val="en-CA"/>
-        </w:rPr>
-        <w:t xml:space="preserve">columns contain the area (meters sq) of each of the land cover categories described by </w:t>
-      </w:r>
-      <w:r>
-        <w:rPr>
-          <w:lang w:val="en-CA"/>
-        </w:rPr>
-        <w:t>the NLCD land cover dataset within a 20km buffer surrounding each city.</w:t>
+        <w:t xml:space="preserve"> columns contain the area (meters sq) of each of the land cover categories described by the NLCD land cover dataset within a 20km buffer surrounding each city.</w:t>
       </w:r>
     </w:p>
     <w:p>
@@ -819,21 +587,7 @@
         <w:rPr>
           <w:lang w:val="en-CA"/>
         </w:rPr>
-        <w:t xml:space="preserve">.csv – this file contains the average park level isolation for all parks within the </w:t>
-      </w:r>
-      <w:proofErr w:type="spellStart"/>
-      <w:r>
-        <w:rPr>
-          <w:lang w:val="en-CA"/>
-        </w:rPr>
-        <w:t>UrbanWatch</w:t>
-      </w:r>
-      <w:proofErr w:type="spellEnd"/>
-      <w:r>
-        <w:rPr>
-          <w:lang w:val="en-CA"/>
-        </w:rPr>
-        <w:t xml:space="preserve"> city boundaries, as calculated using the area and distance weighted isolation metric provided in the text. Multiplying these values by (-1) transforms the value into average park connectivity.</w:t>
+        <w:t>.csv – this file contains the average park level isolation for all parks within the UrbanWatch city boundaries, as calculated using the area and distance weighted isolation metric provided in the text. Multiplying these values by (-1) transforms the value into average park connectivity.</w:t>
       </w:r>
     </w:p>
     <w:p>
@@ -852,21 +606,7 @@
         <w:rPr>
           <w:lang w:val="en-CA"/>
         </w:rPr>
-        <w:t xml:space="preserve">.csv – describes the mean, median, mean (log), and median (log) size of all parks within the </w:t>
-      </w:r>
-      <w:proofErr w:type="spellStart"/>
-      <w:r>
-        <w:rPr>
-          <w:lang w:val="en-CA"/>
-        </w:rPr>
-        <w:t>UrbanWatch</w:t>
-      </w:r>
-      <w:proofErr w:type="spellEnd"/>
-      <w:r>
-        <w:rPr>
-          <w:lang w:val="en-CA"/>
-        </w:rPr>
-        <w:t xml:space="preserve"> city boundaries. Park size was quantified as the total vegetated area of a park polygon contained within the city boundary.</w:t>
+        <w:t>.csv – describes the mean, median, mean (log), and median (log) size of all parks within the UrbanWatch city boundaries. Park size was quantified as the total vegetated area of a park polygon contained within the city boundary.</w:t>
       </w:r>
     </w:p>
     <w:p>
@@ -910,25 +650,7 @@
           <w:bCs/>
           <w:lang w:val="en-CA"/>
         </w:rPr>
-        <w:t>/data/</w:t>
-      </w:r>
-      <w:proofErr w:type="spellStart"/>
-      <w:r>
-        <w:rPr>
-          <w:b/>
-          <w:bCs/>
-          <w:lang w:val="en-CA"/>
-        </w:rPr>
-        <w:t>detections_by_city</w:t>
-      </w:r>
-      <w:proofErr w:type="spellEnd"/>
-      <w:r>
-        <w:rPr>
-          <w:b/>
-          <w:bCs/>
-          <w:lang w:val="en-CA"/>
-        </w:rPr>
-        <w:t>/</w:t>
+        <w:t>/data/detections_by_city/</w:t>
       </w:r>
     </w:p>
     <w:p>
@@ -1039,56 +761,20 @@
         <w:rPr>
           <w:lang w:val="en-CA"/>
         </w:rPr>
-        <w:t>this .</w:t>
-      </w:r>
-      <w:proofErr w:type="spellStart"/>
-      <w:r>
-        <w:rPr>
-          <w:lang w:val="en-CA"/>
-        </w:rPr>
-        <w:t>xslx</w:t>
-      </w:r>
-      <w:proofErr w:type="spellEnd"/>
+        <w:t>this .xslx</w:t>
+      </w:r>
       <w:proofErr w:type="gramEnd"/>
       <w:r>
         <w:rPr>
           <w:lang w:val="en-CA"/>
         </w:rPr>
-        <w:t xml:space="preserve"> </w:t>
-      </w:r>
-      <w:proofErr w:type="spellStart"/>
-      <w:r>
-        <w:rPr>
-          <w:lang w:val="en-CA"/>
-        </w:rPr>
-        <w:t>spreadheet</w:t>
-      </w:r>
-      <w:proofErr w:type="spellEnd"/>
-      <w:r>
-        <w:rPr>
-          <w:lang w:val="en-CA"/>
-        </w:rPr>
-        <w:t xml:space="preserve"> all species highlight in red were added newly by me (J. Ulrich) beginning in May 2025.</w:t>
-      </w:r>
-      <w:r>
-        <w:rPr>
-          <w:lang w:val="en-CA"/>
-        </w:rPr>
-        <w:t xml:space="preserve"> I added data on wingspan from </w:t>
-      </w:r>
-      <w:proofErr w:type="spellStart"/>
-      <w:r>
-        <w:rPr>
-          <w:lang w:val="en-CA"/>
-        </w:rPr>
-        <w:t>LepTraits</w:t>
-      </w:r>
-      <w:proofErr w:type="spellEnd"/>
-      <w:r>
-        <w:rPr>
-          <w:lang w:val="en-CA"/>
-        </w:rPr>
-        <w:t xml:space="preserve"> v1.0 and on feature diversity </w:t>
+        <w:t xml:space="preserve"> spreadheet all species highlight in red were added newly by me (J. Ulrich) beginning in May 2025.</w:t>
+      </w:r>
+      <w:r>
+        <w:rPr>
+          <w:lang w:val="en-CA"/>
+        </w:rPr>
+        <w:t xml:space="preserve"> I added data on wingspan from LepTraits v1.0 and on feature diversity </w:t>
       </w:r>
       <w:r>
         <w:rPr>
@@ -1121,21 +807,7 @@
         <w:rPr>
           <w:lang w:val="en-CA"/>
         </w:rPr>
-        <w:t>features (</w:t>
-      </w:r>
-      <w:proofErr w:type="spellStart"/>
-      <w:r>
-        <w:rPr>
-          <w:lang w:val="en-CA"/>
-        </w:rPr>
-        <w:t>eg</w:t>
-      </w:r>
-      <w:proofErr w:type="spellEnd"/>
-      <w:r>
-        <w:rPr>
-          <w:lang w:val="en-CA"/>
-        </w:rPr>
-        <w:t xml:space="preserve"> “tail”, “spot”, “stripe”) from the identification field, then manually checked and corrected extracted values. Using these raw color and wing feature data, we calculated two derived trait metrics: color diversity (the number of colors present on the butterfly) and feature diversity (the number of features present on the butterfly) to capture potential associations between butterfly appearance and preference bias.</w:t>
+        <w:t>features (eg “tail”, “spot”, “stripe”) from the identification field, then manually checked and corrected extracted values. Using these raw color and wing feature data, we calculated two derived trait metrics: color diversity (the number of colors present on the butterfly) and feature diversity (the number of features present on the butterfly) to capture potential associations between butterfly appearance and preference bias.</w:t>
       </w:r>
     </w:p>
     <w:p>
@@ -1233,21 +905,7 @@
         <w:rPr>
           <w:lang w:val="en-CA"/>
         </w:rPr>
-        <w:t>” file as a starting point for our trait data. We reused these data as a starting point because they included information about taxon name discrepancies between a wider resource for lepidoptera traits (</w:t>
-      </w:r>
-      <w:proofErr w:type="spellStart"/>
-      <w:r>
-        <w:rPr>
-          <w:lang w:val="en-CA"/>
-        </w:rPr>
-        <w:t>Leptraits</w:t>
-      </w:r>
-      <w:proofErr w:type="spellEnd"/>
-      <w:r>
-        <w:rPr>
-          <w:lang w:val="en-CA"/>
-        </w:rPr>
-        <w:t>) and the source that we used for our detection data (GBIF.com).</w:t>
+        <w:t>” file as a starting point for our trait data. We reused these data as a starting point because they included information about taxon name discrepancies between a wider resource for lepidoptera traits (Leptraits) and the source that we used for our detection data (GBIF.com).</w:t>
       </w:r>
     </w:p>
     <w:p>
@@ -1272,21 +930,7 @@
         <w:rPr>
           <w:lang w:val="en-CA"/>
         </w:rPr>
-        <w:t xml:space="preserve"> file contains a list of butterfly species considered for analysis. It is used for resolving taxonomy between iNaturalist, </w:t>
-      </w:r>
-      <w:proofErr w:type="spellStart"/>
-      <w:r>
-        <w:rPr>
-          <w:lang w:val="en-CA"/>
-        </w:rPr>
-        <w:t>eButterfly</w:t>
-      </w:r>
-      <w:proofErr w:type="spellEnd"/>
-      <w:r>
-        <w:rPr>
-          <w:lang w:val="en-CA"/>
-        </w:rPr>
-        <w:t xml:space="preserve">, and the trait data. It also contains the raw trait data aggregated for </w:t>
+        <w:t xml:space="preserve"> file contains a list of butterfly species considered for analysis. It is used for resolving taxonomy between iNaturalist, eButterfly, and the trait data. It also contains the raw trait data aggregated for </w:t>
       </w:r>
       <w:r>
         <w:rPr>
@@ -1357,160 +1001,76 @@
           <w:lang w:val="en-CA"/>
         </w:rPr>
       </w:pPr>
-      <w:proofErr w:type="spellStart"/>
-      <w:r>
-        <w:rPr>
-          <w:lang w:val="en-CA"/>
-        </w:rPr>
-        <w:t>eButterfly_species</w:t>
-      </w:r>
-      <w:proofErr w:type="spellEnd"/>
-      <w:r>
-        <w:rPr>
-          <w:lang w:val="en-CA"/>
-        </w:rPr>
-        <w:t xml:space="preserve"> - the name of the species in </w:t>
-      </w:r>
-      <w:proofErr w:type="spellStart"/>
-      <w:r>
-        <w:rPr>
-          <w:lang w:val="en-CA"/>
-        </w:rPr>
-        <w:t>eButterfly</w:t>
-      </w:r>
-      <w:proofErr w:type="spellEnd"/>
-    </w:p>
-    <w:p>
-      <w:pPr>
-        <w:rPr>
-          <w:lang w:val="en-CA"/>
-        </w:rPr>
-      </w:pPr>
-      <w:proofErr w:type="spellStart"/>
-      <w:r>
-        <w:rPr>
-          <w:lang w:val="en-CA"/>
-        </w:rPr>
-        <w:t>GBIF_species</w:t>
-      </w:r>
-      <w:proofErr w:type="spellEnd"/>
-      <w:r>
-        <w:rPr>
-          <w:lang w:val="en-CA"/>
-        </w:rPr>
-        <w:t xml:space="preserve"> - the name or names of the species in iNaturalist/GBIF, if those species appear in the "species" field</w:t>
-      </w:r>
-    </w:p>
-    <w:p>
-      <w:pPr>
-        <w:rPr>
-          <w:lang w:val="en-CA"/>
-        </w:rPr>
-      </w:pPr>
-      <w:proofErr w:type="spellStart"/>
-      <w:r>
-        <w:rPr>
-          <w:lang w:val="en-CA"/>
-        </w:rPr>
-        <w:t>GBIF_verbatimScientificName</w:t>
-      </w:r>
-      <w:proofErr w:type="spellEnd"/>
-      <w:r>
-        <w:rPr>
-          <w:lang w:val="en-CA"/>
-        </w:rPr>
-        <w:t xml:space="preserve"> - the name or names of the species in iNaturalist/GBIF, if those species appear in the "</w:t>
-      </w:r>
-      <w:proofErr w:type="spellStart"/>
-      <w:r>
-        <w:rPr>
-          <w:lang w:val="en-CA"/>
-        </w:rPr>
-        <w:t>verbatimScientificName</w:t>
-      </w:r>
-      <w:proofErr w:type="spellEnd"/>
-      <w:r>
-        <w:rPr>
-          <w:lang w:val="en-CA"/>
-        </w:rPr>
-        <w:t>" field of GBIF data</w:t>
-      </w:r>
-    </w:p>
-    <w:p>
-      <w:pPr>
-        <w:rPr>
-          <w:lang w:val="en-CA"/>
-        </w:rPr>
-      </w:pPr>
-      <w:proofErr w:type="spellStart"/>
-      <w:r>
-        <w:rPr>
-          <w:lang w:val="en-CA"/>
-        </w:rPr>
-        <w:t>LepTraits_name</w:t>
-      </w:r>
-      <w:proofErr w:type="spellEnd"/>
-      <w:r>
-        <w:rPr>
-          <w:lang w:val="en-CA"/>
-        </w:rPr>
-        <w:t xml:space="preserve"> - the scientific name of the species according to the </w:t>
-      </w:r>
-      <w:proofErr w:type="spellStart"/>
-      <w:r>
-        <w:rPr>
-          <w:lang w:val="en-CA"/>
-        </w:rPr>
-        <w:t>LepTraits</w:t>
-      </w:r>
-      <w:proofErr w:type="spellEnd"/>
-      <w:r>
-        <w:rPr>
-          <w:lang w:val="en-CA"/>
-        </w:rPr>
-        <w:t xml:space="preserve"> dataset</w:t>
-      </w:r>
-    </w:p>
-    <w:p>
-      <w:pPr>
-        <w:rPr>
-          <w:lang w:val="en-CA"/>
-        </w:rPr>
-      </w:pPr>
-      <w:proofErr w:type="spellStart"/>
-      <w:r>
-        <w:rPr>
-          <w:lang w:val="en-CA"/>
-        </w:rPr>
-        <w:t>BAMONA_name</w:t>
-      </w:r>
-      <w:proofErr w:type="spellEnd"/>
-      <w:r>
-        <w:rPr>
-          <w:lang w:val="en-CA"/>
-        </w:rPr>
-        <w:t xml:space="preserve"> - the scientific name of the species according to BAMONA</w:t>
-      </w:r>
-    </w:p>
-    <w:p>
-      <w:pPr>
-        <w:rPr>
-          <w:lang w:val="en-CA"/>
-        </w:rPr>
-      </w:pPr>
-      <w:proofErr w:type="spellStart"/>
-      <w:r>
-        <w:rPr>
-          <w:lang w:val="en-CA"/>
-        </w:rPr>
-        <w:t>aveWingspan</w:t>
-      </w:r>
-      <w:proofErr w:type="spellEnd"/>
-      <w:r>
-        <w:rPr>
-          <w:lang w:val="en-CA"/>
-        </w:rPr>
-        <w:t xml:space="preserve"> - the species' typical wingtip-to-wingtip length, in cm</w:t>
+      <w:r>
+        <w:rPr>
+          <w:lang w:val="en-CA"/>
+        </w:rPr>
+        <w:t>eButterfly_species - the name of the species in eButterfly</w:t>
+      </w:r>
+    </w:p>
+    <w:p>
+      <w:pPr>
+        <w:rPr>
+          <w:lang w:val="en-CA"/>
+        </w:rPr>
+      </w:pPr>
+      <w:r>
+        <w:rPr>
+          <w:lang w:val="en-CA"/>
+        </w:rPr>
+        <w:t>GBIF_species - the name or names of the species in iNaturalist/GBIF, if those species appear in the "species" field</w:t>
+      </w:r>
+    </w:p>
+    <w:p>
+      <w:pPr>
+        <w:rPr>
+          <w:lang w:val="en-CA"/>
+        </w:rPr>
+      </w:pPr>
+      <w:r>
+        <w:rPr>
+          <w:lang w:val="en-CA"/>
+        </w:rPr>
+        <w:t>GBIF_verbatimScientificName - the name or names of the species in iNaturalist/GBIF, if those species appear in the "verbatimScientificName" field of GBIF data</w:t>
+      </w:r>
+    </w:p>
+    <w:p>
+      <w:pPr>
+        <w:rPr>
+          <w:lang w:val="en-CA"/>
+        </w:rPr>
+      </w:pPr>
+      <w:r>
+        <w:rPr>
+          <w:lang w:val="en-CA"/>
+        </w:rPr>
+        <w:t>LepTraits_name - the scientific name of the species according to the LepTraits dataset</w:t>
+      </w:r>
+    </w:p>
+    <w:p>
+      <w:pPr>
+        <w:rPr>
+          <w:lang w:val="en-CA"/>
+        </w:rPr>
+      </w:pPr>
+      <w:r>
+        <w:rPr>
+          <w:lang w:val="en-CA"/>
+        </w:rPr>
+        <w:t>BAMONA_name - the scientific name of the species according to BAMONA</w:t>
+      </w:r>
+    </w:p>
+    <w:p>
+      <w:pPr>
+        <w:rPr>
+          <w:lang w:val="en-CA"/>
+        </w:rPr>
+      </w:pPr>
+      <w:r>
+        <w:rPr>
+          <w:lang w:val="en-CA"/>
+        </w:rPr>
+        <w:t>aveWingspan - the species' typical wingtip-to-wingtip length, in cm</w:t>
       </w:r>
       <w:r>
         <w:rPr>
@@ -1518,32 +1078,22 @@
           <w:iCs/>
           <w:lang w:val="en-CA"/>
         </w:rPr>
-        <w:t xml:space="preserve"> [note from Jens U. (5.8.2025): it appears that Goldstein et al. 2024 calculated this value by average the values of “WS_L” (lower wingspan) and “WS_U” (upper wingspan) as listed in </w:t>
-      </w:r>
-      <w:proofErr w:type="spellStart"/>
+        <w:t xml:space="preserve"> [note from Jens U. (5.8.2025): it appears that Goldstein et al. 2024 calculated this value by average the values of “WS_L” (lower wingspan) and “WS_U” (upper wingspan) as listed in LepTraits</w:t>
+      </w:r>
       <w:r>
         <w:rPr>
           <w:i/>
           <w:iCs/>
           <w:lang w:val="en-CA"/>
         </w:rPr>
-        <w:t>LepTraits</w:t>
-      </w:r>
-      <w:proofErr w:type="spellEnd"/>
+        <w:t>. I performed the same calculation for any new species added to the dataset.</w:t>
+      </w:r>
       <w:r>
         <w:rPr>
           <w:i/>
           <w:iCs/>
           <w:lang w:val="en-CA"/>
         </w:rPr>
-        <w:t>. I performed the same calculation for any new species added to the dataset.</w:t>
-      </w:r>
-      <w:r>
-        <w:rPr>
-          <w:i/>
-          <w:iCs/>
-          <w:lang w:val="en-CA"/>
-        </w:rPr>
         <w:t>]</w:t>
       </w:r>
     </w:p>
@@ -2013,40 +1563,24 @@
           <w:lang w:val="en-CA"/>
         </w:rPr>
       </w:pPr>
-      <w:proofErr w:type="spellStart"/>
-      <w:r>
-        <w:rPr>
-          <w:lang w:val="en-CA"/>
-        </w:rPr>
-        <w:t>colorDiversity</w:t>
-      </w:r>
-      <w:proofErr w:type="spellEnd"/>
-      <w:r>
-        <w:rPr>
-          <w:lang w:val="en-CA"/>
-        </w:rPr>
-        <w:t xml:space="preserve"> - the number of colors present on the species' wing</w:t>
-      </w:r>
-    </w:p>
-    <w:p>
-      <w:pPr>
-        <w:rPr>
-          <w:lang w:val="en-CA"/>
-        </w:rPr>
-      </w:pPr>
-      <w:proofErr w:type="spellStart"/>
-      <w:r>
-        <w:rPr>
-          <w:lang w:val="en-CA"/>
-        </w:rPr>
-        <w:t>featureDiversity</w:t>
-      </w:r>
-      <w:proofErr w:type="spellEnd"/>
-      <w:r>
-        <w:rPr>
-          <w:lang w:val="en-CA"/>
-        </w:rPr>
-        <w:t xml:space="preserve"> - the number of features present on the species' wing</w:t>
+      <w:r>
+        <w:rPr>
+          <w:lang w:val="en-CA"/>
+        </w:rPr>
+        <w:t>colorDiversity - the number of colors present on the species' wing</w:t>
+      </w:r>
+    </w:p>
+    <w:p>
+      <w:pPr>
+        <w:rPr>
+          <w:lang w:val="en-CA"/>
+        </w:rPr>
+      </w:pPr>
+      <w:r>
+        <w:rPr>
+          <w:lang w:val="en-CA"/>
+        </w:rPr>
+        <w:t>featureDiversity - the number of features present on the species' wing</w:t>
       </w:r>
     </w:p>
     <w:p>
@@ -2184,14 +1718,12 @@
           <w:lang w:val="en-CA"/>
         </w:rPr>
       </w:pPr>
-      <w:proofErr w:type="spellStart"/>
       <w:r>
         <w:rPr>
           <w:lang w:val="en-CA"/>
         </w:rPr>
         <w:t>research_grade_detections</w:t>
       </w:r>
-      <w:proofErr w:type="spellEnd"/>
       <w:r>
         <w:rPr>
           <w:lang w:val="en-CA"/>
@@ -2229,14 +1761,12 @@
           <w:lang w:val="en-CA"/>
         </w:rPr>
       </w:pPr>
-      <w:proofErr w:type="spellStart"/>
       <w:r>
         <w:rPr>
           <w:lang w:val="en-CA"/>
         </w:rPr>
         <w:t>total_detections</w:t>
       </w:r>
-      <w:proofErr w:type="spellEnd"/>
       <w:r>
         <w:rPr>
           <w:lang w:val="en-CA"/>
@@ -2286,64 +1816,55 @@
           <w:lang w:val="en-CA"/>
         </w:rPr>
       </w:pPr>
-      <w:proofErr w:type="spellStart"/>
       <w:r>
         <w:rPr>
           <w:lang w:val="en-CA"/>
         </w:rPr>
         <w:t>research_grade_proportion</w:t>
       </w:r>
-      <w:proofErr w:type="spellEnd"/>
       <w:r>
         <w:rPr>
           <w:lang w:val="en-CA"/>
         </w:rPr>
         <w:t xml:space="preserve"> - </w:t>
       </w:r>
-      <w:proofErr w:type="spellStart"/>
       <w:r>
         <w:rPr>
           <w:lang w:val="en-CA"/>
         </w:rPr>
         <w:t>research_grade_detections</w:t>
       </w:r>
-      <w:proofErr w:type="spellEnd"/>
       <w:r>
         <w:rPr>
           <w:lang w:val="en-CA"/>
         </w:rPr>
         <w:t xml:space="preserve"> divided by </w:t>
       </w:r>
-      <w:proofErr w:type="spellStart"/>
       <w:r>
         <w:rPr>
           <w:lang w:val="en-CA"/>
         </w:rPr>
         <w:t>total_detections</w:t>
       </w:r>
-      <w:proofErr w:type="spellEnd"/>
-    </w:p>
-    <w:p>
-      <w:pPr>
-        <w:rPr>
-          <w:lang w:val="en-CA"/>
-        </w:rPr>
-      </w:pPr>
-      <w:proofErr w:type="spellStart"/>
+    </w:p>
+    <w:p>
+      <w:pPr>
+        <w:rPr>
+          <w:lang w:val="en-CA"/>
+        </w:rPr>
+      </w:pPr>
       <w:r>
         <w:rPr>
           <w:lang w:val="en-CA"/>
         </w:rPr>
         <w:t>date_data_obtained</w:t>
       </w:r>
-      <w:proofErr w:type="spellEnd"/>
       <w:r>
         <w:rPr>
           <w:lang w:val="en-CA"/>
         </w:rPr>
         <w:t xml:space="preserve"> - date (</w:t>
       </w:r>
-      <w:proofErr w:type="spellStart"/>
       <w:proofErr w:type="gramStart"/>
       <w:r>
         <w:rPr>
@@ -2351,7 +1872,6 @@
         </w:rPr>
         <w:t>month.day.year</w:t>
       </w:r>
-      <w:proofErr w:type="spellEnd"/>
       <w:proofErr w:type="gramEnd"/>
       <w:r>
         <w:rPr>
@@ -2417,18 +1937,16 @@
           <w:bCs/>
           <w:lang w:val="en-CA"/>
         </w:rPr>
-        <w:t>./data/</w:t>
-      </w:r>
-      <w:proofErr w:type="spellStart"/>
-      <w:r>
-        <w:rPr>
-          <w:b/>
-          <w:bCs/>
-          <w:lang w:val="en-CA"/>
-        </w:rPr>
-        <w:t>lepidoptera_trait_data</w:t>
-      </w:r>
-      <w:proofErr w:type="spellEnd"/>
+        <w:t>./data/lepidoptera_trait_data/</w:t>
+      </w:r>
+      <w:r>
+        <w:rPr>
+          <w:b/>
+          <w:bCs/>
+          <w:lang w:val="en-CA"/>
+        </w:rPr>
+        <w:t>leptraits</w:t>
+      </w:r>
       <w:r>
         <w:rPr>
           <w:b/>
@@ -2437,24 +1955,6 @@
         </w:rPr>
         <w:t>/</w:t>
       </w:r>
-      <w:proofErr w:type="spellStart"/>
-      <w:r>
-        <w:rPr>
-          <w:b/>
-          <w:bCs/>
-          <w:lang w:val="en-CA"/>
-        </w:rPr>
-        <w:t>leptraits</w:t>
-      </w:r>
-      <w:proofErr w:type="spellEnd"/>
-      <w:r>
-        <w:rPr>
-          <w:b/>
-          <w:bCs/>
-          <w:lang w:val="en-CA"/>
-        </w:rPr>
-        <w:t>/</w:t>
-      </w:r>
       <w:r>
         <w:rPr>
           <w:b/>
@@ -2482,21 +1982,7 @@
         <w:rPr>
           <w:lang w:val="en-CA"/>
         </w:rPr>
-        <w:t xml:space="preserve">The full trait database obtained from </w:t>
-      </w:r>
-      <w:proofErr w:type="spellStart"/>
-      <w:r>
-        <w:rPr>
-          <w:lang w:val="en-CA"/>
-        </w:rPr>
-        <w:t>LepTraits</w:t>
-      </w:r>
-      <w:proofErr w:type="spellEnd"/>
-      <w:r>
-        <w:rPr>
-          <w:lang w:val="en-CA"/>
-        </w:rPr>
-        <w:t xml:space="preserve"> v</w:t>
+        <w:t>The full trait database obtained from LepTraits v</w:t>
       </w:r>
       <w:r>
         <w:rPr>
@@ -2550,21 +2036,7 @@
           <w:lang w:val="en-CA"/>
         </w:rPr>
         <w:lastRenderedPageBreak/>
-        <w:t>N.E., Lohman, D.J., and Ries, L. 2022. "</w:t>
-      </w:r>
-      <w:proofErr w:type="spellStart"/>
-      <w:r>
-        <w:rPr>
-          <w:lang w:val="en-CA"/>
-        </w:rPr>
-        <w:t>LepTraits</w:t>
-      </w:r>
-      <w:proofErr w:type="spellEnd"/>
-      <w:r>
-        <w:rPr>
-          <w:lang w:val="en-CA"/>
-        </w:rPr>
-        <w:t xml:space="preserve"> 1.0: A globally comprehensive dataset of butterfly traits." Pre-print available.</w:t>
+        <w:t>N.E., Lohman, D.J., and Ries, L. 2022. "LepTraits 1.0: A globally comprehensive dataset of butterfly traits." Pre-print available.</w:t>
       </w:r>
     </w:p>
     <w:p>
@@ -3194,7 +2666,6 @@
   <w:style w:type="character" w:default="1" w:styleId="DefaultParagraphFont">
     <w:name w:val="Default Paragraph Font"/>
     <w:uiPriority w:val="1"/>
-    <w:semiHidden/>
     <w:unhideWhenUsed/>
   </w:style>
   <w:style w:type="table" w:default="1" w:styleId="TableNormal">

</xml_diff>